<commit_message>
La asistencia pasa al libro cuando el docente la envía (C119, U32 resuelta)
- En Pasar lista, Clase › «Actualizar la asistencia en el libro de
  calificaciones» lleva el porcentaje a ATTRGRD (57,14 → INH, 85,71 → APRO).
- Ruta en el Autoservicio Docentes: tarjeta «Detalle de Notas y Asistencia».
- Guías, skill de Computación, datos y Word de preguntas actualizados.

Co-Authored-By: Claude Opus 5.5 <noreply@anthropic.com>
Claude-Session: https://claude.ai/code/session_01Et949gzMXkqp3pKk4UbR4f
</commit_message>
<xml_diff>
--- a/docs/dudas/PREGUNTAS PARA ELLUCIAN - REUNIÓN 27-10 - CENTROS EMPRESARIALES.docx
+++ b/docs/dudas/PREGUNTAS PARA ELLUCIAN - REUNIÓN 27-10 - CENTROS EMPRESARIALES.docx
@@ -179,7 +179,7 @@
         <w:rPr>
           <w:color w:val="6B6478"/>
         </w:rPr>
-        <w:t xml:space="preserve">  ·  26 preguntas</w:t>
+        <w:t xml:space="preserve">  ·  25 preguntas</w:t>
       </w:r>
     </w:p>
     <w:p>
@@ -191,14 +191,14 @@
         <w:rPr>
           <w:sz w:val="19"/>
         </w:rPr>
-        <w:t xml:space="preserve">Notas y asistencia (hoy bloquean el cierre): </w:t>
+        <w:t xml:space="preserve">Notas (bloquean el cierre de Idiomas y Emprendimiento): </w:t>
       </w:r>
       <w:r>
         <w:rPr>
           <w:color w:val="6B6478"/>
           <w:sz w:val="19"/>
         </w:rPr>
-        <w:t>U32, E22</w:t>
+        <w:t>E22</w:t>
       </w:r>
     </w:p>
     <w:p>
@@ -544,7 +544,7 @@
         <w:pStyle w:val="Heading2"/>
       </w:pPr>
       <w:r>
-        <w:t>Notas y asistencia (hoy bloquean el cierre)</w:t>
+        <w:t>Notas (bloquean el cierre de Idiomas y Emprendimiento)</w:t>
       </w:r>
     </w:p>
     <w:p>
@@ -555,10 +555,10 @@
         <w:rPr>
           <w:color w:val="7030A0"/>
         </w:rPr>
-        <w:t xml:space="preserve">U32  </w:t>
-      </w:r>
-      <w:r>
-        <w:t>La asistencia no llega sola a ATTRGRD</w:t>
+        <w:t xml:space="preserve">E22  </w:t>
+      </w:r>
+      <w:r>
+        <w:t>Escala de Idiomas y Emprendimiento en SHAGRDE</w:t>
       </w:r>
     </w:p>
     <w:p>
@@ -570,74 +570,7 @@
           <w:b w:val="0"/>
           <w:i w:val="0"/>
         </w:rPr>
-        <w:t xml:space="preserve">El porcentaje de asistencia no llega a </w:t>
-      </w:r>
-      <w:r>
-        <w:rPr>
-          <w:b/>
-          <w:i w:val="0"/>
-        </w:rPr>
-        <w:t>ATTRGRD</w:t>
-      </w:r>
-      <w:r>
-        <w:rPr>
-          <w:b/>
-          <w:i/>
-          <w:color w:val="6B6478"/>
-        </w:rPr>
-        <w:t xml:space="preserve"> (componente de asistencia)</w:t>
-      </w:r>
-      <w:r>
-        <w:rPr>
-          <w:b w:val="0"/>
-          <w:i w:val="0"/>
-        </w:rPr>
-        <w:t xml:space="preserve"> aunque la configuración de TI del instructivo 7.1.0 está completa (GORICCR</w:t>
-      </w:r>
-      <w:r>
-        <w:rPr>
-          <w:b w:val="0"/>
-          <w:i/>
-          <w:color w:val="6B6478"/>
-        </w:rPr>
-        <w:t xml:space="preserve"> (valores de configuración de las integraciones)</w:t>
-      </w:r>
-      <w:r>
-        <w:rPr>
-          <w:b w:val="0"/>
-          <w:i w:val="0"/>
-        </w:rPr>
-        <w:t xml:space="preserve"> en Y, GORRSQL</w:t>
-      </w:r>
-      <w:r>
-        <w:rPr>
-          <w:b w:val="0"/>
-          <w:i/>
-          <w:color w:val="6B6478"/>
-        </w:rPr>
-        <w:t xml:space="preserve"> (reglas SQL de los procesos)</w:t>
-      </w:r>
-      <w:r>
-        <w:rPr>
-          <w:b w:val="0"/>
-          <w:i w:val="0"/>
-        </w:rPr>
-        <w:t xml:space="preserve"> activa y validada). ¿Qué falta revisar: (a) el segundo registro de la regla en GORRSQL; (b) el cálculo por horas, si el panel de Pasar lista muestra «Horas asistidas 00:00» con la unidad Presente/Ausente de SOAATRK</w:t>
-      </w:r>
-      <w:r>
-        <w:rPr>
-          <w:b w:val="0"/>
-          <w:i/>
-          <w:color w:val="6B6478"/>
-        </w:rPr>
-        <w:t xml:space="preserve"> (regla de control de asistencia del NRC)</w:t>
-      </w:r>
-      <w:r>
-        <w:rPr>
-          <w:b w:val="0"/>
-          <w:i w:val="0"/>
-        </w:rPr>
-        <w:t xml:space="preserve">; (c) que el tipo de reunión y la sesión coincidan con </w:t>
+        <w:t xml:space="preserve">En Computación el pase a historia falló hasta agregar el modo </w:t>
       </w:r>
       <w:r>
         <w:rPr>
@@ -646,14 +579,14 @@
           <w:i w:val="0"/>
           <w:sz w:val="19"/>
         </w:rPr>
-        <w:t>:MEETING_CODE</w:t>
+        <w:t>V</w:t>
       </w:r>
       <w:r>
         <w:rPr>
           <w:b w:val="0"/>
           <w:i w:val="0"/>
         </w:rPr>
-        <w:t xml:space="preserve"> y </w:t>
+        <w:t xml:space="preserve"> para el nivel </w:t>
       </w:r>
       <w:r>
         <w:rPr>
@@ -662,14 +595,117 @@
           <w:i w:val="0"/>
           <w:sz w:val="19"/>
         </w:rPr>
-        <w:t>:SESSION_ID</w:t>
+        <w:t>C</w:t>
       </w:r>
       <w:r>
         <w:rPr>
           <w:b w:val="0"/>
           <w:i w:val="0"/>
         </w:rPr>
-        <w:t>; (d) la acción del docente que dispara el envío?</w:t>
+        <w:t xml:space="preserve"> (U20, C35). ¿Ya existen en SHAGRDE</w:t>
+      </w:r>
+      <w:r>
+        <w:rPr>
+          <w:b w:val="0"/>
+          <w:i/>
+          <w:color w:val="6B6478"/>
+        </w:rPr>
+        <w:t xml:space="preserve"> (códigos de calificación)</w:t>
+      </w:r>
+      <w:r>
+        <w:rPr>
+          <w:b w:val="0"/>
+          <w:i w:val="0"/>
+        </w:rPr>
+        <w:t xml:space="preserve"> los códigos del modo </w:t>
+      </w:r>
+      <w:r>
+        <w:rPr>
+          <w:rFonts w:ascii="Consolas" w:hAnsi="Consolas"/>
+          <w:b w:val="0"/>
+          <w:i w:val="0"/>
+          <w:sz w:val="19"/>
+        </w:rPr>
+        <w:t>C</w:t>
+      </w:r>
+      <w:r>
+        <w:rPr>
+          <w:b w:val="0"/>
+          <w:i w:val="0"/>
+        </w:rPr>
+        <w:t xml:space="preserve"> (00 a 100) para el nivel </w:t>
+      </w:r>
+      <w:r>
+        <w:rPr>
+          <w:rFonts w:ascii="Consolas" w:hAnsi="Consolas"/>
+          <w:b w:val="0"/>
+          <w:i w:val="0"/>
+          <w:sz w:val="19"/>
+        </w:rPr>
+        <w:t>I</w:t>
+      </w:r>
+      <w:r>
+        <w:rPr>
+          <w:b w:val="0"/>
+          <w:i w:val="0"/>
+        </w:rPr>
+        <w:t xml:space="preserve"> y del modo </w:t>
+      </w:r>
+      <w:r>
+        <w:rPr>
+          <w:rFonts w:ascii="Consolas" w:hAnsi="Consolas"/>
+          <w:b w:val="0"/>
+          <w:i w:val="0"/>
+          <w:sz w:val="19"/>
+        </w:rPr>
+        <w:t>V</w:t>
+      </w:r>
+      <w:r>
+        <w:rPr>
+          <w:b w:val="0"/>
+          <w:i w:val="0"/>
+        </w:rPr>
+        <w:t xml:space="preserve"> (00 a 20) para el nivel </w:t>
+      </w:r>
+      <w:r>
+        <w:rPr>
+          <w:rFonts w:ascii="Consolas" w:hAnsi="Consolas"/>
+          <w:b w:val="0"/>
+          <w:i w:val="0"/>
+          <w:sz w:val="19"/>
+        </w:rPr>
+        <w:t>M</w:t>
+      </w:r>
+      <w:r>
+        <w:rPr>
+          <w:b w:val="0"/>
+          <w:i w:val="0"/>
+        </w:rPr>
+        <w:t xml:space="preserve">, con </w:t>
+      </w:r>
+      <w:r>
+        <w:rPr>
+          <w:rFonts w:ascii="Consolas" w:hAnsi="Consolas"/>
+          <w:b w:val="0"/>
+          <w:i w:val="0"/>
+          <w:sz w:val="19"/>
+        </w:rPr>
+        <w:t>INH</w:t>
+      </w:r>
+      <w:r>
+        <w:rPr>
+          <w:b w:val="0"/>
+          <w:i/>
+          <w:color w:val="6B6478"/>
+        </w:rPr>
+        <w:t xml:space="preserve"> (nota de desaprobado por asistencia)</w:t>
+      </w:r>
+      <w:r>
+        <w:rPr>
+          <w:b w:val="0"/>
+          <w:i w:val="0"/>
+        </w:rPr>
+        <w:t>? ¿Quién los crea antes del primer cierre?</w:t>
       </w:r>
     </w:p>
     <w:p>
@@ -692,61 +728,7 @@
           <w:color w:val="4A4458"/>
           <w:sz w:val="19"/>
         </w:rPr>
-        <w:t>Con el porcentaje cargado, la nota final sale INH</w:t>
-      </w:r>
-      <w:r>
-        <w:rPr>
-          <w:b w:val="0"/>
-          <w:i/>
-          <w:color w:val="6B6478"/>
-          <w:sz w:val="19"/>
-        </w:rPr>
-        <w:t xml:space="preserve"> (nota de desaprobado por asistencia)</w:t>
-      </w:r>
-      <w:r>
-        <w:rPr>
-          <w:b w:val="0"/>
-          <w:i w:val="0"/>
-          <w:color w:val="4A4458"/>
-          <w:sz w:val="19"/>
-        </w:rPr>
-        <w:t xml:space="preserve"> en SFASLST</w:t>
-      </w:r>
-      <w:r>
-        <w:rPr>
-          <w:b w:val="0"/>
-          <w:i/>
-          <w:color w:val="6B6478"/>
-          <w:sz w:val="19"/>
-        </w:rPr>
-        <w:t xml:space="preserve"> (notas por backoffice)</w:t>
-      </w:r>
-      <w:r>
-        <w:rPr>
-          <w:b w:val="0"/>
-          <w:i w:val="0"/>
-          <w:color w:val="4A4458"/>
-          <w:sz w:val="19"/>
-        </w:rPr>
-        <w:t xml:space="preserve"> (C105, C107). Según el instructivo 7.1.1 (diap. 56 y 57), el docente pulsa Clase › «Actualizar la asistencia en el libro de calificaciones» (R21); falta probarlo con el NRC</w:t>
-      </w:r>
-      <w:r>
-        <w:rPr>
-          <w:b w:val="0"/>
-          <w:i/>
-          <w:color w:val="6B6478"/>
-          <w:sz w:val="19"/>
-        </w:rPr>
-        <w:t xml:space="preserve"> (Número de Referencia de Curso)</w:t>
-      </w:r>
-      <w:r>
-        <w:rPr>
-          <w:b w:val="0"/>
-          <w:i w:val="0"/>
-          <w:color w:val="4A4458"/>
-          <w:sz w:val="19"/>
-        </w:rPr>
-        <w:t xml:space="preserve"> 10044.</w:t>
+        <w:t>Idiomas califica con el modo C (00 a 100, aprueba con 70); Computación y Emprendimiento con el modo V (00 a 20, aprueba con 11) (C65, ADR-009).</w:t>
       </w:r>
     </w:p>
     <w:tbl>
@@ -810,20 +792,28 @@
     </w:p>
     <w:p>
       <w:pPr>
-        <w:pStyle w:val="Heading3"/>
-      </w:pPr>
-      <w:r>
-        <w:rPr>
-          <w:color w:val="7030A0"/>
-        </w:rPr>
-        <w:t xml:space="preserve">E22  </w:t>
-      </w:r>
-      <w:r>
-        <w:t>Escala de Idiomas y Emprendimiento en SHAGRDE</w:t>
+        <w:pStyle w:val="Heading2"/>
+      </w:pPr>
+      <w:r>
+        <w:t>Periodos, horas y prerrequisitos</w:t>
       </w:r>
     </w:p>
     <w:p>
       <w:pPr>
+        <w:pStyle w:val="Heading3"/>
+      </w:pPr>
+      <w:r>
+        <w:rPr>
+          <w:color w:val="7030A0"/>
+        </w:rPr>
+        <w:t xml:space="preserve">E01  </w:t>
+      </w:r>
+      <w:r>
+        <w:t>Hora de clase de 45 y 50 minutos en el mismo periodo</w:t>
+      </w:r>
+    </w:p>
+    <w:p>
+      <w:pPr>
         <w:keepNext/>
       </w:pPr>
       <w:r>
@@ -831,39 +821,35 @@
           <w:b w:val="0"/>
           <w:i w:val="0"/>
         </w:rPr>
-        <w:t xml:space="preserve">En Computación el pase a historia falló hasta agregar el modo </w:t>
-      </w:r>
-      <w:r>
-        <w:rPr>
-          <w:rFonts w:ascii="Consolas" w:hAnsi="Consolas"/>
+        <w:t xml:space="preserve">Hora de clase de </w:t>
+      </w:r>
+      <w:r>
+        <w:rPr>
+          <w:b/>
+          <w:i w:val="0"/>
+        </w:rPr>
+        <w:t>45 min (día)</w:t>
+      </w:r>
+      <w:r>
+        <w:rPr>
           <w:b w:val="0"/>
           <w:i w:val="0"/>
-          <w:sz w:val="19"/>
-        </w:rPr>
-        <w:t>V</w:t>
+        </w:rPr>
+        <w:t xml:space="preserve"> y </w:t>
+      </w:r>
+      <w:r>
+        <w:rPr>
+          <w:b/>
+          <w:i w:val="0"/>
+        </w:rPr>
+        <w:t>50 min (noche)</w:t>
       </w:r>
       <w:r>
         <w:rPr>
           <w:b w:val="0"/>
           <w:i w:val="0"/>
         </w:rPr>
-        <w:t xml:space="preserve"> para el nivel </w:t>
-      </w:r>
-      <w:r>
-        <w:rPr>
-          <w:rFonts w:ascii="Consolas" w:hAnsi="Consolas"/>
-          <w:b w:val="0"/>
-          <w:i w:val="0"/>
-          <w:sz w:val="19"/>
-        </w:rPr>
-        <w:t>C</w:t>
-      </w:r>
-      <w:r>
-        <w:rPr>
-          <w:b w:val="0"/>
-          <w:i w:val="0"/>
-        </w:rPr>
-        <w:t xml:space="preserve"> (U20, C35). ¿Ya existen en SHAGRDE</w:t>
+        <w:t xml:space="preserve"> en el mismo periodo: ¿cómo se configura si SIATERM</w:t>
       </w:r>
       <w:r>
         <w:rPr>
@@ -871,94 +857,44 @@
           <w:i/>
           <w:color w:val="6B6478"/>
         </w:rPr>
-        <w:t xml:space="preserve"> (códigos de calificación)</w:t>
+        <w:t xml:space="preserve"> (Control de periodo de carga docente)</w:t>
       </w:r>
       <w:r>
         <w:rPr>
           <w:b w:val="0"/>
           <w:i w:val="0"/>
         </w:rPr>
-        <w:t xml:space="preserve"> los códigos del modo </w:t>
-      </w:r>
-      <w:r>
-        <w:rPr>
-          <w:rFonts w:ascii="Consolas" w:hAnsi="Consolas"/>
+        <w:t xml:space="preserve"> tiene un solo factor de duración? ¿Se ajustan a mano las horas del NRC</w:t>
+      </w:r>
+      <w:r>
+        <w:rPr>
+          <w:b w:val="0"/>
+          <w:i/>
+          <w:color w:val="6B6478"/>
+        </w:rPr>
+        <w:t xml:space="preserve"> (Número de Referencia de Curso)</w:t>
+      </w:r>
+      <w:r>
+        <w:rPr>
           <w:b w:val="0"/>
           <w:i w:val="0"/>
-          <w:sz w:val="19"/>
-        </w:rPr>
-        <w:t>C</w:t>
+        </w:rPr>
+        <w:t xml:space="preserve"> en SSASECT</w:t>
+      </w:r>
+      <w:r>
+        <w:rPr>
+          <w:b w:val="0"/>
+          <w:i/>
+          <w:color w:val="6B6478"/>
+        </w:rPr>
+        <w:t xml:space="preserve"> (Programar NRC)</w:t>
       </w:r>
       <w:r>
         <w:rPr>
           <w:b w:val="0"/>
           <w:i w:val="0"/>
         </w:rPr>
-        <w:t xml:space="preserve"> (00 a 100) para el nivel </w:t>
-      </w:r>
-      <w:r>
-        <w:rPr>
-          <w:rFonts w:ascii="Consolas" w:hAnsi="Consolas"/>
-          <w:b w:val="0"/>
-          <w:i w:val="0"/>
-          <w:sz w:val="19"/>
-        </w:rPr>
-        <w:t>I</w:t>
-      </w:r>
-      <w:r>
-        <w:rPr>
-          <w:b w:val="0"/>
-          <w:i w:val="0"/>
-        </w:rPr>
-        <w:t xml:space="preserve"> y del modo </w:t>
-      </w:r>
-      <w:r>
-        <w:rPr>
-          <w:rFonts w:ascii="Consolas" w:hAnsi="Consolas"/>
-          <w:b w:val="0"/>
-          <w:i w:val="0"/>
-          <w:sz w:val="19"/>
-        </w:rPr>
-        <w:t>V</w:t>
-      </w:r>
-      <w:r>
-        <w:rPr>
-          <w:b w:val="0"/>
-          <w:i w:val="0"/>
-        </w:rPr>
-        <w:t xml:space="preserve"> (00 a 20) para el nivel </w:t>
-      </w:r>
-      <w:r>
-        <w:rPr>
-          <w:rFonts w:ascii="Consolas" w:hAnsi="Consolas"/>
-          <w:b w:val="0"/>
-          <w:i w:val="0"/>
-          <w:sz w:val="19"/>
-        </w:rPr>
-        <w:t>M</w:t>
-      </w:r>
-      <w:r>
-        <w:rPr>
-          <w:b w:val="0"/>
-          <w:i w:val="0"/>
-        </w:rPr>
-        <w:t xml:space="preserve">, con </w:t>
-      </w:r>
-      <w:r>
-        <w:rPr>
-          <w:rFonts w:ascii="Consolas" w:hAnsi="Consolas"/>
-          <w:b w:val="0"/>
-          <w:i w:val="0"/>
-          <w:sz w:val="19"/>
-        </w:rPr>
-        <w:t>INH</w:t>
-      </w:r>
-      <w:r>
-        <w:rPr>
-          <w:b w:val="0"/>
-          <w:i w:val="0"/>
-        </w:rPr>
-        <w:t>? ¿Quién los crea antes del primer cierre?</w:t>
+        <w:t>?</w:t>
       </w:r>
     </w:p>
     <w:p>
@@ -981,7 +917,25 @@
           <w:color w:val="4A4458"/>
           <w:sz w:val="19"/>
         </w:rPr>
-        <w:t>Idiomas califica con el modo C (00 a 100, aprueba con 70); Computación y Emprendimiento con el modo V (00 a 20, aprueba con 11) (C65, ADR-009).</w:t>
+        <w:t>SIATERM tiene un solo factor de duración por periodo y SSASECT calcula las horas con ese valor (R07; 5.2, diap. 12). Hoy en SEUSS</w:t>
+      </w:r>
+      <w:r>
+        <w:rPr>
+          <w:b w:val="0"/>
+          <w:i/>
+          <w:color w:val="6B6478"/>
+          <w:sz w:val="19"/>
+        </w:rPr>
+        <w:t xml:space="preserve"> (sistema académico actual de la USS)</w:t>
+      </w:r>
+      <w:r>
+        <w:rPr>
+          <w:b w:val="0"/>
+          <w:i w:val="0"/>
+          <w:color w:val="4A4458"/>
+          <w:sz w:val="19"/>
+        </w:rPr>
+        <w:t>: 45 min de día y 50 de noche cuentan como 1 hora (C05).</w:t>
       </w:r>
     </w:p>
     <w:tbl>
@@ -1045,28 +999,20 @@
     </w:p>
     <w:p>
       <w:pPr>
-        <w:pStyle w:val="Heading2"/>
-      </w:pPr>
-      <w:r>
-        <w:t>Periodos, horas y prerrequisitos</w:t>
+        <w:pStyle w:val="Heading3"/>
+      </w:pPr>
+      <w:r>
+        <w:rPr>
+          <w:color w:val="7030A0"/>
+        </w:rPr>
+        <w:t xml:space="preserve">E03  </w:t>
+      </w:r>
+      <w:r>
+        <w:t>Hora de 60 minutos</w:t>
       </w:r>
     </w:p>
     <w:p>
       <w:pPr>
-        <w:pStyle w:val="Heading3"/>
-      </w:pPr>
-      <w:r>
-        <w:rPr>
-          <w:color w:val="7030A0"/>
-        </w:rPr>
-        <w:t xml:space="preserve">E01  </w:t>
-      </w:r>
-      <w:r>
-        <w:t>Hora de clase de 45 y 50 minutos en el mismo periodo</w:t>
-      </w:r>
-    </w:p>
-    <w:p>
-      <w:pPr>
         <w:keepNext/>
       </w:pPr>
       <w:r>
@@ -1074,65 +1020,21 @@
           <w:b w:val="0"/>
           <w:i w:val="0"/>
         </w:rPr>
-        <w:t xml:space="preserve">Hora de clase de </w:t>
+        <w:t xml:space="preserve">Hora de </w:t>
       </w:r>
       <w:r>
         <w:rPr>
           <w:b/>
           <w:i w:val="0"/>
         </w:rPr>
-        <w:t>45 min (día)</w:t>
+        <w:t>60 minutos</w:t>
       </w:r>
       <w:r>
         <w:rPr>
           <w:b w:val="0"/>
           <w:i w:val="0"/>
         </w:rPr>
-        <w:t xml:space="preserve"> y </w:t>
-      </w:r>
-      <w:r>
-        <w:rPr>
-          <w:b/>
-          <w:i w:val="0"/>
-        </w:rPr>
-        <w:t>50 min (noche)</w:t>
-      </w:r>
-      <w:r>
-        <w:rPr>
-          <w:b w:val="0"/>
-          <w:i w:val="0"/>
-        </w:rPr>
-        <w:t xml:space="preserve"> en el mismo periodo: ¿cómo se configura si SIATERM</w:t>
-      </w:r>
-      <w:r>
-        <w:rPr>
-          <w:b w:val="0"/>
-          <w:i/>
-          <w:color w:val="6B6478"/>
-        </w:rPr>
-        <w:t xml:space="preserve"> (Control de periodo de carga docente)</w:t>
-      </w:r>
-      <w:r>
-        <w:rPr>
-          <w:b w:val="0"/>
-          <w:i w:val="0"/>
-        </w:rPr>
-        <w:t xml:space="preserve"> tiene un solo factor de duración? ¿Se ajustan a mano las horas del NRC en SSASECT</w:t>
-      </w:r>
-      <w:r>
-        <w:rPr>
-          <w:b w:val="0"/>
-          <w:i/>
-          <w:color w:val="6B6478"/>
-        </w:rPr>
-        <w:t xml:space="preserve"> (Programar NRC)</w:t>
-      </w:r>
-      <w:r>
-        <w:rPr>
-          <w:b w:val="0"/>
-          <w:i w:val="0"/>
-        </w:rPr>
-        <w:t>?</w:t>
+        <w:t>: si se necesita (carga o pago del docente), ¿dónde se registra?</w:t>
       </w:r>
     </w:p>
     <w:p>
@@ -1155,25 +1057,7 @@
           <w:color w:val="4A4458"/>
           <w:sz w:val="19"/>
         </w:rPr>
-        <w:t>SIATERM tiene un solo factor de duración por periodo y SSASECT calcula las horas con ese valor (R07; 5.2, diap. 12). Hoy en SEUSS</w:t>
-      </w:r>
-      <w:r>
-        <w:rPr>
-          <w:b w:val="0"/>
-          <w:i/>
-          <w:color w:val="6B6478"/>
-          <w:sz w:val="19"/>
-        </w:rPr>
-        <w:t xml:space="preserve"> (sistema académico actual de la USS)</w:t>
-      </w:r>
-      <w:r>
-        <w:rPr>
-          <w:b w:val="0"/>
-          <w:i w:val="0"/>
-          <w:color w:val="4A4458"/>
-          <w:sz w:val="19"/>
-        </w:rPr>
-        <w:t>: 45 min de día y 50 de noche cuentan como 1 hora (C05).</w:t>
+        <w:t>Además de la hora de clase existe una hora presencial de 60 min, como la hora de trabajo (C05).</w:t>
       </w:r>
     </w:p>
     <w:tbl>
@@ -1243,10 +1127,10 @@
         <w:rPr>
           <w:color w:val="7030A0"/>
         </w:rPr>
-        <w:t xml:space="preserve">E03  </w:t>
-      </w:r>
-      <w:r>
-        <w:t>Hora de 60 minutos</w:t>
+        <w:t xml:space="preserve">E13  </w:t>
+      </w:r>
+      <w:r>
+        <w:t>«En progreso» con grupos seguidos</w:t>
       </w:r>
     </w:p>
     <w:p>
@@ -1258,21 +1142,36 @@
           <w:b w:val="0"/>
           <w:i w:val="0"/>
         </w:rPr>
-        <w:t xml:space="preserve">Hora de </w:t>
+        <w:t xml:space="preserve">Casilla </w:t>
       </w:r>
       <w:r>
         <w:rPr>
           <w:b/>
           <w:i w:val="0"/>
         </w:rPr>
-        <w:t>60 minutos</w:t>
+        <w:t>«En progreso»</w:t>
       </w:r>
       <w:r>
         <w:rPr>
           <w:b w:val="0"/>
           <w:i w:val="0"/>
         </w:rPr>
-        <w:t>: si se necesita (carga o pago del docente), ¿dónde se registra?</w:t>
+        <w:t xml:space="preserve"> de SOATERM</w:t>
+      </w:r>
+      <w:r>
+        <w:rPr>
+          <w:b w:val="0"/>
+          <w:i/>
+          <w:color w:val="6B6478"/>
+        </w:rPr>
+        <w:t xml:space="preserve"> (Control de periodo)</w:t>
+      </w:r>
+      <w:r>
+        <w:rPr>
+          <w:b w:val="0"/>
+          <w:i w:val="0"/>
+        </w:rPr>
+        <w:t>: con grupos seguidos (I04 termina el 31/5 e I06 empieza el 1/6), ¿se marca? Si se marca y luego desaprueba BASIC I, ¿Banner lo retira de BASIC II o se hace a mano?</w:t>
       </w:r>
     </w:p>
     <w:p>
@@ -1295,7 +1194,25 @@
           <w:color w:val="4A4458"/>
           <w:sz w:val="19"/>
         </w:rPr>
-        <w:t>Además de la hora de clase existe una hora presencial de 60 min, como la hora de trabajo (C05).</w:t>
+        <w:t>Con «En progreso» marcado en SOATERM, el curso en curso cuenta como completo para el prerrequisito; se revisa contra SSAPREQ</w:t>
+      </w:r>
+      <w:r>
+        <w:rPr>
+          <w:b w:val="0"/>
+          <w:i/>
+          <w:color w:val="6B6478"/>
+          <w:sz w:val="19"/>
+        </w:rPr>
+        <w:t xml:space="preserve"> (prerrequisitos del NRC)</w:t>
+      </w:r>
+      <w:r>
+        <w:rPr>
+          <w:b w:val="0"/>
+          <w:i w:val="0"/>
+          <w:color w:val="4A4458"/>
+          <w:sz w:val="19"/>
+        </w:rPr>
+        <w:t xml:space="preserve"> al calificar (R10; 1.1.2, diap. 18 y 19).</w:t>
       </w:r>
     </w:p>
     <w:tbl>
@@ -1365,10 +1282,10 @@
         <w:rPr>
           <w:color w:val="7030A0"/>
         </w:rPr>
-        <w:t xml:space="preserve">E13  </w:t>
-      </w:r>
-      <w:r>
-        <w:t>«En progreso» con grupos seguidos</w:t>
+        <w:t xml:space="preserve">E04  </w:t>
+      </w:r>
+      <w:r>
+        <w:t>BASIC I después de pasar con examen de suficiencia</w:t>
       </w:r>
     </w:p>
     <w:p>
@@ -1380,21 +1297,21 @@
           <w:b w:val="0"/>
           <w:i w:val="0"/>
         </w:rPr>
-        <w:t xml:space="preserve">Casilla </w:t>
+        <w:t xml:space="preserve">Si un participante pasa a BASIC II con </w:t>
       </w:r>
       <w:r>
         <w:rPr>
           <w:b/>
           <w:i w:val="0"/>
         </w:rPr>
-        <w:t>«En progreso»</w:t>
+        <w:t>examen de suficiencia</w:t>
       </w:r>
       <w:r>
         <w:rPr>
           <w:b w:val="0"/>
           <w:i w:val="0"/>
         </w:rPr>
-        <w:t xml:space="preserve"> de SOATERM</w:t>
+        <w:t>, ¿cómo queda BASIC I en la historia y en CAPP</w:t>
       </w:r>
       <w:r>
         <w:rPr>
@@ -1402,14 +1319,14 @@
           <w:i/>
           <w:color w:val="6B6478"/>
         </w:rPr>
-        <w:t xml:space="preserve"> (Control de periodo)</w:t>
+        <w:t xml:space="preserve"> (evaluación del avance en la malla)</w:t>
       </w:r>
       <w:r>
         <w:rPr>
           <w:b w:val="0"/>
           <w:i w:val="0"/>
         </w:rPr>
-        <w:t>: con grupos seguidos (I04 termina el 31/5 e I06 empieza el 1/6), ¿se marca? Si se marca y luego desaprueba BASIC I, ¿Banner lo retira de BASIC II o se hace a mano?</w:t>
+        <w:t>: pendiente o reconocido?</w:t>
       </w:r>
     </w:p>
     <w:p>
@@ -1432,7 +1349,7 @@
           <w:color w:val="4A4458"/>
           <w:sz w:val="19"/>
         </w:rPr>
-        <w:t>Con «En progreso» marcado en SOATERM, el curso en curso cuenta como completo para el prerrequisito; se revisa contra SSAPREQ</w:t>
+        <w:t>El prerrequisito «BASIC I aprobado o suficiencia con puntaje mínimo» va en SCAPREQ</w:t>
       </w:r>
       <w:r>
         <w:rPr>
@@ -1441,7 +1358,7 @@
           <w:color w:val="6B6478"/>
           <w:sz w:val="19"/>
         </w:rPr>
-        <w:t xml:space="preserve"> (prerrequisitos del NRC)</w:t>
+        <w:t xml:space="preserve"> (prerrequisitos y puntajes de examen del catálogo)</w:t>
       </w:r>
       <w:r>
         <w:rPr>
@@ -1450,7 +1367,25 @@
           <w:color w:val="4A4458"/>
           <w:sz w:val="19"/>
         </w:rPr>
-        <w:t xml:space="preserve"> al calificar (R10; 1.1.2, diap. 18 y 19).</w:t>
+        <w:t xml:space="preserve"> y el puntaje en SOATEST</w:t>
+      </w:r>
+      <w:r>
+        <w:rPr>
+          <w:b w:val="0"/>
+          <w:i/>
+          <w:color w:val="6B6478"/>
+          <w:sz w:val="19"/>
+        </w:rPr>
+        <w:t xml:space="preserve"> (puntajes de examen del estudiante)</w:t>
+      </w:r>
+      <w:r>
+        <w:rPr>
+          <w:b w:val="0"/>
+          <w:i w:val="0"/>
+          <w:color w:val="4A4458"/>
+          <w:sz w:val="19"/>
+        </w:rPr>
+        <w:t xml:space="preserve"> (R03, R09). En Idiomas, quien desaprueba no avanza salvo con suficiencia (C11).</w:t>
       </w:r>
     </w:p>
     <w:tbl>
@@ -1514,20 +1449,28 @@
     </w:p>
     <w:p>
       <w:pPr>
-        <w:pStyle w:val="Heading3"/>
-      </w:pPr>
-      <w:r>
-        <w:rPr>
-          <w:color w:val="7030A0"/>
-        </w:rPr>
-        <w:t xml:space="preserve">E04  </w:t>
-      </w:r>
-      <w:r>
-        <w:t>BASIC I después de pasar con examen de suficiencia</w:t>
+        <w:pStyle w:val="Heading2"/>
+      </w:pPr>
+      <w:r>
+        <w:t>Mallas y CAPP</w:t>
       </w:r>
     </w:p>
     <w:p>
       <w:pPr>
+        <w:pStyle w:val="Heading3"/>
+      </w:pPr>
+      <w:r>
+        <w:rPr>
+          <w:color w:val="7030A0"/>
+        </w:rPr>
+        <w:t xml:space="preserve">E05  </w:t>
+      </w:r>
+      <w:r>
+        <w:t>Malla de los centros en CAPP</w:t>
+      </w:r>
+    </w:p>
+    <w:p>
+      <w:pPr>
         <w:keepNext/>
       </w:pPr>
       <w:r>
@@ -1535,21 +1478,21 @@
           <w:b w:val="0"/>
           <w:i w:val="0"/>
         </w:rPr>
-        <w:t xml:space="preserve">Si un participante pasa a BASIC II con </w:t>
+        <w:t xml:space="preserve">¿Los programas de los tres centros tendrán su </w:t>
       </w:r>
       <w:r>
         <w:rPr>
           <w:b/>
           <w:i w:val="0"/>
         </w:rPr>
-        <w:t>examen de suficiencia</w:t>
+        <w:t>malla en CAPP</w:t>
       </w:r>
       <w:r>
         <w:rPr>
           <w:b w:val="0"/>
           <w:i w:val="0"/>
         </w:rPr>
-        <w:t>, ¿cómo queda BASIC I en la historia y en CAPP</w:t>
+        <w:t xml:space="preserve"> (SMAPROG</w:t>
       </w:r>
       <w:r>
         <w:rPr>
@@ -1557,14 +1500,29 @@
           <w:i/>
           <w:color w:val="6B6478"/>
         </w:rPr>
-        <w:t xml:space="preserve"> (evaluación del avance en la malla)</w:t>
+        <w:t xml:space="preserve"> (requerimientos del programa: la malla)</w:t>
       </w:r>
       <w:r>
         <w:rPr>
           <w:b w:val="0"/>
           <w:i w:val="0"/>
         </w:rPr>
-        <w:t>: pendiente o reconocido?</w:t>
+        <w:t>, SMAAREA</w:t>
+      </w:r>
+      <w:r>
+        <w:rPr>
+          <w:b w:val="0"/>
+          <w:i/>
+          <w:color w:val="6B6478"/>
+        </w:rPr>
+        <w:t xml:space="preserve"> (requerimientos de área de la malla)</w:t>
+      </w:r>
+      <w:r>
+        <w:rPr>
+          <w:b w:val="0"/>
+          <w:i w:val="0"/>
+        </w:rPr>
+        <w:t>)? Si no, ¿cómo funciona la inscripción proyectada?</w:t>
       </w:r>
     </w:p>
     <w:p>
@@ -1587,43 +1545,7 @@
           <w:color w:val="4A4458"/>
           <w:sz w:val="19"/>
         </w:rPr>
-        <w:t>El prerrequisito «BASIC I aprobado o suficiencia con puntaje mínimo» va en SCAPREQ</w:t>
-      </w:r>
-      <w:r>
-        <w:rPr>
-          <w:b w:val="0"/>
-          <w:i/>
-          <w:color w:val="6B6478"/>
-          <w:sz w:val="19"/>
-        </w:rPr>
-        <w:t xml:space="preserve"> (prerrequisitos y puntajes de examen del catálogo)</w:t>
-      </w:r>
-      <w:r>
-        <w:rPr>
-          <w:b w:val="0"/>
-          <w:i w:val="0"/>
-          <w:color w:val="4A4458"/>
-          <w:sz w:val="19"/>
-        </w:rPr>
-        <w:t xml:space="preserve"> y el puntaje en SOATEST</w:t>
-      </w:r>
-      <w:r>
-        <w:rPr>
-          <w:b w:val="0"/>
-          <w:i/>
-          <w:color w:val="6B6478"/>
-          <w:sz w:val="19"/>
-        </w:rPr>
-        <w:t xml:space="preserve"> (puntajes de examen del estudiante)</w:t>
-      </w:r>
-      <w:r>
-        <w:rPr>
-          <w:b w:val="0"/>
-          <w:i w:val="0"/>
-          <w:color w:val="4A4458"/>
-          <w:sz w:val="19"/>
-        </w:rPr>
-        <w:t xml:space="preserve"> (R03, R09). En Idiomas, quien desaprueba no avanza salvo con suficiencia (C11).</w:t>
+        <w:t>Reglas curriculares cargadas: Idiomas MI03-01 y MI03-02; Computación MC38-01 (regla ECOM-01); Emprendimiento MM01-01 a MM01-03. La matrícula por Proyecciones del Autoservicio ya se validó (C71).</w:t>
       </w:r>
     </w:p>
     <w:tbl>
@@ -1687,28 +1609,20 @@
     </w:p>
     <w:p>
       <w:pPr>
-        <w:pStyle w:val="Heading2"/>
-      </w:pPr>
-      <w:r>
-        <w:t>Mallas y CAPP</w:t>
+        <w:pStyle w:val="Heading3"/>
+      </w:pPr>
+      <w:r>
+        <w:rPr>
+          <w:color w:val="7030A0"/>
+        </w:rPr>
+        <w:t xml:space="preserve">E15  </w:t>
+      </w:r>
+      <w:r>
+        <w:t>Programa sin plan completo al abrir 20271</w:t>
       </w:r>
     </w:p>
     <w:p>
       <w:pPr>
-        <w:pStyle w:val="Heading3"/>
-      </w:pPr>
-      <w:r>
-        <w:rPr>
-          <w:color w:val="7030A0"/>
-        </w:rPr>
-        <w:t xml:space="preserve">E05  </w:t>
-      </w:r>
-      <w:r>
-        <w:t>Malla de los centros en CAPP</w:t>
-      </w:r>
-    </w:p>
-    <w:p>
-      <w:pPr>
         <w:keepNext/>
       </w:pPr>
       <w:r>
@@ -1716,51 +1630,7 @@
           <w:b w:val="0"/>
           <w:i w:val="0"/>
         </w:rPr>
-        <w:t xml:space="preserve">¿Los programas de los tres centros tendrán su </w:t>
-      </w:r>
-      <w:r>
-        <w:rPr>
-          <w:b/>
-          <w:i w:val="0"/>
-        </w:rPr>
-        <w:t>malla en CAPP</w:t>
-      </w:r>
-      <w:r>
-        <w:rPr>
-          <w:b w:val="0"/>
-          <w:i w:val="0"/>
-        </w:rPr>
-        <w:t xml:space="preserve"> (SMAPROG</w:t>
-      </w:r>
-      <w:r>
-        <w:rPr>
-          <w:b w:val="0"/>
-          <w:i/>
-          <w:color w:val="6B6478"/>
-        </w:rPr>
-        <w:t xml:space="preserve"> (requerimientos del programa: la malla)</w:t>
-      </w:r>
-      <w:r>
-        <w:rPr>
-          <w:b w:val="0"/>
-          <w:i w:val="0"/>
-        </w:rPr>
-        <w:t>, SMAAREA</w:t>
-      </w:r>
-      <w:r>
-        <w:rPr>
-          <w:b w:val="0"/>
-          <w:i/>
-          <w:color w:val="6B6478"/>
-        </w:rPr>
-        <w:t xml:space="preserve"> (requerimientos de área de la malla)</w:t>
-      </w:r>
-      <w:r>
-        <w:rPr>
-          <w:b w:val="0"/>
-          <w:i w:val="0"/>
-        </w:rPr>
-        <w:t>)? Si no, ¿cómo funciona la inscripción proyectada?</w:t>
+        <w:t>¿Qué se hace si un programa no tiene su plan completo (cursos, versión, equivalencias) al abrir 20271?</w:t>
       </w:r>
     </w:p>
     <w:p>
@@ -1783,7 +1653,7 @@
           <w:color w:val="4A4458"/>
           <w:sz w:val="19"/>
         </w:rPr>
-        <w:t>Reglas curriculares cargadas: Idiomas MI03-01 y MI03-02; Computación MC38-01 (regla ECOM-01); Emprendimiento MM01-01 a MM01-03. La matrícula por Proyecciones del Autoservicio ya se validó (C71).</w:t>
+        <w:t>Sin cursos en el catálogo no hay NRC; los cursos nuevos se crean antes de cambiar las áreas y los equivalentes deben existir antes (R12).</w:t>
       </w:r>
     </w:p>
     <w:tbl>
@@ -1853,10 +1723,10 @@
         <w:rPr>
           <w:color w:val="7030A0"/>
         </w:rPr>
-        <w:t xml:space="preserve">E15  </w:t>
-      </w:r>
-      <w:r>
-        <w:t>Programa sin plan completo al abrir 20271</w:t>
+        <w:t xml:space="preserve">E16  </w:t>
+      </w:r>
+      <w:r>
+        <w:t>Lo que ve el tutor sin malla cargada</w:t>
       </w:r>
     </w:p>
     <w:p>
@@ -1868,30 +1738,7 @@
           <w:b w:val="0"/>
           <w:i w:val="0"/>
         </w:rPr>
-        <w:t>¿Qué se hace si un programa no tiene su plan completo (cursos, versión, equivalencias) al abrir 20271?</w:t>
-      </w:r>
-    </w:p>
-    <w:p>
-      <w:pPr>
-        <w:keepNext/>
-        <w:ind w:left="170"/>
-      </w:pPr>
-      <w:r>
-        <w:rPr>
-          <w:b/>
-          <w:color w:val="4EA72E"/>
-          <w:sz w:val="19"/>
-        </w:rPr>
-        <w:t xml:space="preserve">Lo que ya sabemos: </w:t>
-      </w:r>
-      <w:r>
-        <w:rPr>
-          <w:b w:val="0"/>
-          <w:i w:val="0"/>
-          <w:color w:val="4A4458"/>
-          <w:sz w:val="19"/>
-        </w:rPr>
-        <w:t>Sin cursos en el catálogo no hay NRC; los cursos nuevos se crean antes de cambiar las áreas y los equivalentes deben existir antes (R12).</w:t>
+        <w:t>Tutores: ¿qué ve el tutor en el autoservicio si el programa del estudiante no tiene su malla cargada?</w:t>
       </w:r>
     </w:p>
     <w:tbl>
@@ -1955,20 +1802,28 @@
     </w:p>
     <w:p>
       <w:pPr>
-        <w:pStyle w:val="Heading3"/>
-      </w:pPr>
-      <w:r>
-        <w:rPr>
-          <w:color w:val="7030A0"/>
-        </w:rPr>
-        <w:t xml:space="preserve">E16  </w:t>
-      </w:r>
-      <w:r>
-        <w:t>Lo que ve el tutor sin malla cargada</w:t>
+        <w:pStyle w:val="Heading2"/>
+      </w:pPr>
+      <w:r>
+        <w:t>Docentes y carga lectiva</w:t>
       </w:r>
     </w:p>
     <w:p>
       <w:pPr>
+        <w:pStyle w:val="Heading3"/>
+      </w:pPr>
+      <w:r>
+        <w:rPr>
+          <w:color w:val="7030A0"/>
+        </w:rPr>
+        <w:t xml:space="preserve">E14  </w:t>
+      </w:r>
+      <w:r>
+        <w:t>Reemplazo de un docente a mitad del curso</w:t>
+      </w:r>
+    </w:p>
+    <w:p>
+      <w:pPr>
         <w:keepNext/>
       </w:pPr>
       <w:r>
@@ -1976,7 +1831,48 @@
           <w:b w:val="0"/>
           <w:i w:val="0"/>
         </w:rPr>
-        <w:t>Tutores: ¿qué ve el tutor en el autoservicio si el programa del estudiante no tiene su malla cargada?</w:t>
+        <w:t>Reemplazo de docente: ¿el docente anterior se deja en el NRC con su % (historial y pago) o se elimina? ¿Qué pasa con sus notas ya registradas y con la encuesta de evaluación docente?</w:t>
+      </w:r>
+    </w:p>
+    <w:p>
+      <w:pPr>
+        <w:keepNext/>
+        <w:ind w:left="170"/>
+      </w:pPr>
+      <w:r>
+        <w:rPr>
+          <w:b/>
+          <w:color w:val="4EA72E"/>
+          <w:sz w:val="19"/>
+        </w:rPr>
+        <w:t xml:space="preserve">Lo que ya sabemos: </w:t>
+      </w:r>
+      <w:r>
+        <w:rPr>
+          <w:b w:val="0"/>
+          <w:i w:val="0"/>
+          <w:color w:val="4A4458"/>
+          <w:sz w:val="19"/>
+        </w:rPr>
+        <w:t>El nuevo docente se asigna en SSASECT como principal con su % de responsabilidad; si PRIMINSTR</w:t>
+      </w:r>
+      <w:r>
+        <w:rPr>
+          <w:b w:val="0"/>
+          <w:i/>
+          <w:color w:val="6B6478"/>
+          <w:sz w:val="19"/>
+        </w:rPr>
+        <w:t xml:space="preserve"> (regla que define si solo el docente principal registra notas)</w:t>
+      </w:r>
+      <w:r>
+        <w:rPr>
+          <w:b w:val="0"/>
+          <w:i w:val="0"/>
+          <w:color w:val="4A4458"/>
+          <w:sz w:val="19"/>
+        </w:rPr>
+        <w:t xml:space="preserve"> = Y, solo el principal registra notas (R11).</w:t>
       </w:r>
     </w:p>
     <w:tbl>
@@ -2040,28 +1936,20 @@
     </w:p>
     <w:p>
       <w:pPr>
-        <w:pStyle w:val="Heading2"/>
-      </w:pPr>
-      <w:r>
-        <w:t>Docentes y carga lectiva</w:t>
+        <w:pStyle w:val="Heading3"/>
+      </w:pPr>
+      <w:r>
+        <w:rPr>
+          <w:color w:val="7030A0"/>
+        </w:rPr>
+        <w:t xml:space="preserve">E20  </w:t>
+      </w:r>
+      <w:r>
+        <w:t>SIAFLRT o SIAFLCT y el factor FTE</w:t>
       </w:r>
     </w:p>
     <w:p>
       <w:pPr>
-        <w:pStyle w:val="Heading3"/>
-      </w:pPr>
-      <w:r>
-        <w:rPr>
-          <w:color w:val="7030A0"/>
-        </w:rPr>
-        <w:t xml:space="preserve">E14  </w:t>
-      </w:r>
-      <w:r>
-        <w:t>Reemplazo de un docente a mitad del curso</w:t>
-      </w:r>
-    </w:p>
-    <w:p>
-      <w:pPr>
         <w:keepNext/>
       </w:pPr>
       <w:r>
@@ -2069,7 +1957,110 @@
           <w:b w:val="0"/>
           <w:i w:val="0"/>
         </w:rPr>
-        <w:t>Reemplazo de docente: ¿el docente anterior se deja en el NRC con su % (historial y pago) o se elimina? ¿Qué pasa con sus notas ya registradas y con la encuesta de evaluación docente?</w:t>
+        <w:t xml:space="preserve">(A) ¿Se pueden usar </w:t>
+      </w:r>
+      <w:r>
+        <w:rPr>
+          <w:b/>
+          <w:i w:val="0"/>
+        </w:rPr>
+        <w:t>SIAFLRT</w:t>
+      </w:r>
+      <w:r>
+        <w:rPr>
+          <w:b/>
+          <w:i/>
+          <w:color w:val="6B6478"/>
+        </w:rPr>
+        <w:t xml:space="preserve"> (reglas de carga docente)</w:t>
+      </w:r>
+      <w:r>
+        <w:rPr>
+          <w:b w:val="0"/>
+          <w:i w:val="0"/>
+        </w:rPr>
+        <w:t xml:space="preserve"> (regla de carga, en SIAASGN</w:t>
+      </w:r>
+      <w:r>
+        <w:rPr>
+          <w:b w:val="0"/>
+          <w:i/>
+          <w:color w:val="6B6478"/>
+        </w:rPr>
+        <w:t xml:space="preserve"> (Asignación de docente, su carga)</w:t>
+      </w:r>
+      <w:r>
+        <w:rPr>
+          <w:b w:val="0"/>
+          <w:i w:val="0"/>
+        </w:rPr>
+        <w:t xml:space="preserve">) y </w:t>
+      </w:r>
+      <w:r>
+        <w:rPr>
+          <w:b/>
+          <w:i w:val="0"/>
+        </w:rPr>
+        <w:t>SIAFLCT</w:t>
+      </w:r>
+      <w:r>
+        <w:rPr>
+          <w:b/>
+          <w:i/>
+          <w:color w:val="6B6478"/>
+        </w:rPr>
+        <w:t xml:space="preserve"> (reglas de carga por tipo de contrato)</w:t>
+      </w:r>
+      <w:r>
+        <w:rPr>
+          <w:b w:val="0"/>
+          <w:i w:val="0"/>
+        </w:rPr>
+        <w:t xml:space="preserve"> (contrato, en SIACONA</w:t>
+      </w:r>
+      <w:r>
+        <w:rPr>
+          <w:b w:val="0"/>
+          <w:i/>
+          <w:color w:val="6B6478"/>
+        </w:rPr>
+        <w:t xml:space="preserve"> (análisis de la carga por contrato)</w:t>
+      </w:r>
+      <w:r>
+        <w:rPr>
+          <w:b w:val="0"/>
+          <w:i w:val="0"/>
+        </w:rPr>
+        <w:t xml:space="preserve">) a la vez, o recomiendan una sola? (b) En los periodos de Centros, ¿conviene poner el </w:t>
+      </w:r>
+      <w:r>
+        <w:rPr>
+          <w:b/>
+          <w:i w:val="0"/>
+        </w:rPr>
+        <w:t>factor FTE</w:t>
+      </w:r>
+      <w:r>
+        <w:rPr>
+          <w:b/>
+          <w:i/>
+          <w:color w:val="6B6478"/>
+        </w:rPr>
+        <w:t xml:space="preserve"> (equivalente a tiempo completo)</w:t>
+      </w:r>
+      <w:r>
+        <w:rPr>
+          <w:b/>
+          <w:i w:val="0"/>
+        </w:rPr>
+        <w:t xml:space="preserve"> de SIATERM en 48</w:t>
+      </w:r>
+      <w:r>
+        <w:rPr>
+          <w:b w:val="0"/>
+          <w:i w:val="0"/>
+        </w:rPr>
+        <w:t>, para que un especialista de 48 horas sea 1 FTE?</w:t>
       </w:r>
     </w:p>
     <w:p>
@@ -2092,25 +2083,7 @@
           <w:color w:val="4A4458"/>
           <w:sz w:val="19"/>
         </w:rPr>
-        <w:t>El nuevo docente se asigna en SSASECT como principal con su % de responsabilidad; si PRIMINSTR</w:t>
-      </w:r>
-      <w:r>
-        <w:rPr>
-          <w:b w:val="0"/>
-          <w:i/>
-          <w:color w:val="6B6478"/>
-          <w:sz w:val="19"/>
-        </w:rPr>
-        <w:t xml:space="preserve"> (regla que define si solo el docente principal registra notas)</w:t>
-      </w:r>
-      <w:r>
-        <w:rPr>
-          <w:b w:val="0"/>
-          <w:i w:val="0"/>
-          <w:color w:val="4A4458"/>
-          <w:sz w:val="19"/>
-        </w:rPr>
-        <w:t xml:space="preserve"> = Y, solo el principal registra notas (R11).</w:t>
+        <w:t>El instructivo las presenta como dos formas de evaluar la carga, no excluyentes (R19). ADR-020 recomienda medir por contrato (SIAFLCT y SIACONA). Contratos ES (48 h) y FC ya creados (C54 a C57).</w:t>
       </w:r>
     </w:p>
     <w:tbl>
@@ -2174,20 +2147,28 @@
     </w:p>
     <w:p>
       <w:pPr>
-        <w:pStyle w:val="Heading3"/>
-      </w:pPr>
-      <w:r>
-        <w:rPr>
-          <w:color w:val="7030A0"/>
-        </w:rPr>
-        <w:t xml:space="preserve">E20  </w:t>
-      </w:r>
-      <w:r>
-        <w:t>SIAFLRT o SIAFLCT y el factor FTE</w:t>
+        <w:pStyle w:val="Heading2"/>
+      </w:pPr>
+      <w:r>
+        <w:t>Finanzas y matrícula</w:t>
       </w:r>
     </w:p>
     <w:p>
       <w:pPr>
+        <w:pStyle w:val="Heading3"/>
+      </w:pPr>
+      <w:r>
+        <w:rPr>
+          <w:color w:val="7030A0"/>
+        </w:rPr>
+        <w:t xml:space="preserve">U29  </w:t>
+      </w:r>
+      <w:r>
+        <w:t>Cambio de modalidad de pago entre partes de periodo</w:t>
+      </w:r>
+    </w:p>
+    <w:p>
+      <w:pPr>
         <w:keepNext/>
       </w:pPr>
       <w:r>
@@ -2195,110 +2176,7 @@
           <w:b w:val="0"/>
           <w:i w:val="0"/>
         </w:rPr>
-        <w:t xml:space="preserve">(A) ¿Se pueden usar </w:t>
-      </w:r>
-      <w:r>
-        <w:rPr>
-          <w:b/>
-          <w:i w:val="0"/>
-        </w:rPr>
-        <w:t>SIAFLRT</w:t>
-      </w:r>
-      <w:r>
-        <w:rPr>
-          <w:b/>
-          <w:i/>
-          <w:color w:val="6B6478"/>
-        </w:rPr>
-        <w:t xml:space="preserve"> (reglas de carga docente)</w:t>
-      </w:r>
-      <w:r>
-        <w:rPr>
-          <w:b w:val="0"/>
-          <w:i w:val="0"/>
-        </w:rPr>
-        <w:t xml:space="preserve"> (regla de carga, en SIAASGN</w:t>
-      </w:r>
-      <w:r>
-        <w:rPr>
-          <w:b w:val="0"/>
-          <w:i/>
-          <w:color w:val="6B6478"/>
-        </w:rPr>
-        <w:t xml:space="preserve"> (Asignación de docente, su carga)</w:t>
-      </w:r>
-      <w:r>
-        <w:rPr>
-          <w:b w:val="0"/>
-          <w:i w:val="0"/>
-        </w:rPr>
-        <w:t xml:space="preserve">) y </w:t>
-      </w:r>
-      <w:r>
-        <w:rPr>
-          <w:b/>
-          <w:i w:val="0"/>
-        </w:rPr>
-        <w:t>SIAFLCT</w:t>
-      </w:r>
-      <w:r>
-        <w:rPr>
-          <w:b/>
-          <w:i/>
-          <w:color w:val="6B6478"/>
-        </w:rPr>
-        <w:t xml:space="preserve"> (reglas de carga por tipo de contrato)</w:t>
-      </w:r>
-      <w:r>
-        <w:rPr>
-          <w:b w:val="0"/>
-          <w:i w:val="0"/>
-        </w:rPr>
-        <w:t xml:space="preserve"> (contrato, en SIACONA</w:t>
-      </w:r>
-      <w:r>
-        <w:rPr>
-          <w:b w:val="0"/>
-          <w:i/>
-          <w:color w:val="6B6478"/>
-        </w:rPr>
-        <w:t xml:space="preserve"> (análisis de la carga por contrato)</w:t>
-      </w:r>
-      <w:r>
-        <w:rPr>
-          <w:b w:val="0"/>
-          <w:i w:val="0"/>
-        </w:rPr>
-        <w:t xml:space="preserve">) a la vez, o recomiendan una sola? (b) En los periodos de Centros, ¿conviene poner el </w:t>
-      </w:r>
-      <w:r>
-        <w:rPr>
-          <w:b/>
-          <w:i w:val="0"/>
-        </w:rPr>
-        <w:t>factor FTE</w:t>
-      </w:r>
-      <w:r>
-        <w:rPr>
-          <w:b/>
-          <w:i/>
-          <w:color w:val="6B6478"/>
-        </w:rPr>
-        <w:t xml:space="preserve"> (equivalente a tiempo completo)</w:t>
-      </w:r>
-      <w:r>
-        <w:rPr>
-          <w:b/>
-          <w:i w:val="0"/>
-        </w:rPr>
-        <w:t xml:space="preserve"> de SIATERM en 48</w:t>
-      </w:r>
-      <w:r>
-        <w:rPr>
-          <w:b w:val="0"/>
-          <w:i w:val="0"/>
-        </w:rPr>
-        <w:t>, para que un especialista de 48 horas sea 1 FTE?</w:t>
+        <w:t>¿Un estudiante que eligió una modalidad de pago (ej. 3 cuotas) para su primer curso (ej. parte de periodo I04), puede cambiar su modalidad de pago si inicia un segundo curso en otra parte de periodo dentro del mismo semestre (ej. I05)? Pregunta planteada por Sandra Valdiviezo (USS) en chat de coordinación de Centros.</w:t>
       </w:r>
     </w:p>
     <w:p>
@@ -2321,7 +2199,7 @@
           <w:color w:val="4A4458"/>
           <w:sz w:val="19"/>
         </w:rPr>
-        <w:t>El instructivo las presenta como dos formas de evaluar la carga, no excluyentes (R19). ADR-020 recomienda medir por contrato (SIAFLCT y SIACONA). Contratos ES (48 h) y FC ya creados (C54 a C57).</w:t>
+        <w:t>Pregunta de Sandra Valdiviezo (USS) en el chat de coordinación. El plan de cuotas I1 se probó en TEST (TSAISTC, TSPISTA, C76 a C80).</w:t>
       </w:r>
     </w:p>
     <w:tbl>
@@ -2385,28 +2263,20 @@
     </w:p>
     <w:p>
       <w:pPr>
-        <w:pStyle w:val="Heading2"/>
-      </w:pPr>
-      <w:r>
-        <w:t>Finanzas y matrícula</w:t>
+        <w:pStyle w:val="Heading3"/>
+      </w:pPr>
+      <w:r>
+        <w:rPr>
+          <w:color w:val="7030A0"/>
+        </w:rPr>
+        <w:t xml:space="preserve">E23  </w:t>
+      </w:r>
+      <w:r>
+        <w:t>Estimación en línea para pagar al matricular</w:t>
       </w:r>
     </w:p>
     <w:p>
       <w:pPr>
-        <w:pStyle w:val="Heading3"/>
-      </w:pPr>
-      <w:r>
-        <w:rPr>
-          <w:color w:val="7030A0"/>
-        </w:rPr>
-        <w:t xml:space="preserve">U29  </w:t>
-      </w:r>
-      <w:r>
-        <w:t>Cambio de modalidad de pago entre partes de periodo</w:t>
-      </w:r>
-    </w:p>
-    <w:p>
-      <w:pPr>
         <w:keepNext/>
       </w:pPr>
       <w:r>
@@ -2414,7 +2284,22 @@
           <w:b w:val="0"/>
           <w:i w:val="0"/>
         </w:rPr>
-        <w:t>¿Un estudiante que eligió una modalidad de pago (ej. 3 cuotas) para su primer curso (ej. parte de periodo I04), puede cambiar su modalidad de pago si inicia un segundo curso en otra parte de periodo dentro del mismo semestre (ej. I05)? Pregunta planteada por Sandra Valdiviezo (USS) en chat de coordinación de Centros.</w:t>
+        <w:t>¿Quién la habilita (SOATERM, SFARGFE</w:t>
+      </w:r>
+      <w:r>
+        <w:rPr>
+          <w:b w:val="0"/>
+          <w:i/>
+          <w:color w:val="6B6478"/>
+        </w:rPr>
+        <w:t xml:space="preserve"> (reglas de cobro de la inscripción)</w:t>
+      </w:r>
+      <w:r>
+        <w:rPr>
+          <w:b w:val="0"/>
+          <w:i w:val="0"/>
+        </w:rPr>
+        <w:t>) para que el cargo se liquide al matricular y el alumno pague en línea, y desde cuándo?</w:t>
       </w:r>
     </w:p>
     <w:p>
@@ -2437,7 +2322,25 @@
           <w:color w:val="4A4458"/>
           <w:sz w:val="19"/>
         </w:rPr>
-        <w:t>Pregunta de Sandra Valdiviezo (USS) en el chat de coordinación. El plan de cuotas I1 se probó en TEST (TSAISTC, TSPISTA, C76 a C80).</w:t>
+        <w:t>Liliana Ocampo (Ellucian) indicó que hay que habilitarla para que el cargo se liquide al instante, sin esperar el proceso por lotes SFRFASC</w:t>
+      </w:r>
+      <w:r>
+        <w:rPr>
+          <w:b w:val="0"/>
+          <w:i/>
+          <w:color w:val="6B6478"/>
+          <w:sz w:val="19"/>
+        </w:rPr>
+        <w:t xml:space="preserve"> (estimación de cuotas por lotes)</w:t>
+      </w:r>
+      <w:r>
+        <w:rPr>
+          <w:b w:val="0"/>
+          <w:i w:val="0"/>
+          <w:color w:val="4A4458"/>
+          <w:sz w:val="19"/>
+        </w:rPr>
+        <w:t xml:space="preserve"> (C82).</w:t>
       </w:r>
     </w:p>
     <w:tbl>
@@ -2507,10 +2410,10 @@
         <w:rPr>
           <w:color w:val="7030A0"/>
         </w:rPr>
-        <w:t xml:space="preserve">E23  </w:t>
-      </w:r>
-      <w:r>
-        <w:t>Estimación en línea para pagar al matricular</w:t>
+        <w:t xml:space="preserve">E24  </w:t>
+      </w:r>
+      <w:r>
+        <w:t>GAP de Finanzas para elegir el plan de pagos</w:t>
       </w:r>
     </w:p>
     <w:p>
@@ -2522,7 +2425,7 @@
           <w:b w:val="0"/>
           <w:i w:val="0"/>
         </w:rPr>
-        <w:t>¿Quién la habilita (SOATERM, SFARGFE</w:t>
+        <w:t>¿En qué estado está y cuándo entra? Mientras tanto, ¿el plan de cuotas se asigna en SAAADMS</w:t>
       </w:r>
       <w:r>
         <w:rPr>
@@ -2530,14 +2433,14 @@
           <w:i/>
           <w:color w:val="6B6478"/>
         </w:rPr>
-        <w:t xml:space="preserve"> (reglas de cobro de la inscripción)</w:t>
+        <w:t xml:space="preserve"> (solicitud de admisión)</w:t>
       </w:r>
       <w:r>
         <w:rPr>
           <w:b w:val="0"/>
           <w:i w:val="0"/>
         </w:rPr>
-        <w:t>) para que el cargo se liquide al matricular y el alumno pague en línea, y desde cuándo?</w:t>
+        <w:t xml:space="preserve"> como se probó en TEST (C78)?</w:t>
       </w:r>
     </w:p>
     <w:p>
@@ -2560,25 +2463,7 @@
           <w:color w:val="4A4458"/>
           <w:sz w:val="19"/>
         </w:rPr>
-        <w:t>Liliana Ocampo (Ellucian) indicó que hay que habilitarla para que el cargo se liquide al instante, sin esperar el proceso por lotes SFRFASC</w:t>
-      </w:r>
-      <w:r>
-        <w:rPr>
-          <w:b w:val="0"/>
-          <w:i/>
-          <w:color w:val="6B6478"/>
-          <w:sz w:val="19"/>
-        </w:rPr>
-        <w:t xml:space="preserve"> (estimación de cuotas por lotes)</w:t>
-      </w:r>
-      <w:r>
-        <w:rPr>
-          <w:b w:val="0"/>
-          <w:i w:val="0"/>
-          <w:color w:val="4A4458"/>
-          <w:sz w:val="19"/>
-        </w:rPr>
-        <w:t xml:space="preserve"> (C82).</w:t>
+        <w:t>La selección del plan por el alumno entrará con un desarrollo a medida pedido por Finanzas (C82). En TEST el plan se asignó en SAAADMS (C78).</w:t>
       </w:r>
     </w:p>
     <w:tbl>
@@ -2642,20 +2527,28 @@
     </w:p>
     <w:p>
       <w:pPr>
-        <w:pStyle w:val="Heading3"/>
-      </w:pPr>
-      <w:r>
-        <w:rPr>
-          <w:color w:val="7030A0"/>
-        </w:rPr>
-        <w:t xml:space="preserve">E24  </w:t>
-      </w:r>
-      <w:r>
-        <w:t>GAP de Finanzas para elegir el plan de pagos</w:t>
+        <w:pStyle w:val="Heading2"/>
+      </w:pPr>
+      <w:r>
+        <w:t>Aula virtual</w:t>
       </w:r>
     </w:p>
     <w:p>
       <w:pPr>
+        <w:pStyle w:val="Heading3"/>
+      </w:pPr>
+      <w:r>
+        <w:rPr>
+          <w:color w:val="7030A0"/>
+        </w:rPr>
+        <w:t xml:space="preserve">E02  </w:t>
+      </w:r>
+      <w:r>
+        <w:t>Qué sale al aula virtual y si las notas regresan</w:t>
+      </w:r>
+    </w:p>
+    <w:p>
+      <w:pPr>
         <w:keepNext/>
       </w:pPr>
       <w:r>
@@ -2663,22 +2556,21 @@
           <w:b w:val="0"/>
           <w:i w:val="0"/>
         </w:rPr>
-        <w:t>¿En qué estado está y cuándo entra? Mientras tanto, ¿el plan de cuotas se asigna en SAAADMS</w:t>
-      </w:r>
-      <w:r>
-        <w:rPr>
-          <w:b w:val="0"/>
-          <w:i/>
-          <w:color w:val="6B6478"/>
-        </w:rPr>
-        <w:t xml:space="preserve"> (solicitud de admisión)</w:t>
+        <w:t xml:space="preserve">Aula virtual: ¿las </w:t>
+      </w:r>
+      <w:r>
+        <w:rPr>
+          <w:b/>
+          <w:i w:val="0"/>
+        </w:rPr>
+        <w:t>notas regresan</w:t>
       </w:r>
       <w:r>
         <w:rPr>
           <w:b w:val="0"/>
           <w:i w:val="0"/>
         </w:rPr>
-        <w:t xml:space="preserve"> como se probó en TEST (C78)?</w:t>
+        <w:t xml:space="preserve"> a Banner? ¿Qué datos salen (NRC, docente, participantes, plan de evaluación)?</w:t>
       </w:r>
     </w:p>
     <w:p>
@@ -2701,7 +2593,7 @@
           <w:color w:val="4A4458"/>
           <w:sz w:val="19"/>
         </w:rPr>
-        <w:t>La selección del plan por el alumno entrará con un desarrollo a medida pedido por Finanzas (C82). En TEST el plan se asignó en SAAADMS (C78).</w:t>
+        <w:t>El NRC se vincula con el campo «Socio de integración» de SSASECT; los datos del NRC salen al aula virtual (R06; 6.2.4, diap. 10 a 14).</w:t>
       </w:r>
     </w:p>
     <w:tbl>
@@ -2768,7 +2660,7 @@
         <w:pStyle w:val="Heading2"/>
       </w:pPr>
       <w:r>
-        <w:t>Aula virtual</w:t>
+        <w:t>Solicitudes, certificados y seguimiento</w:t>
       </w:r>
     </w:p>
     <w:p>
@@ -2779,10 +2671,10 @@
         <w:rPr>
           <w:color w:val="7030A0"/>
         </w:rPr>
-        <w:t xml:space="preserve">E02  </w:t>
-      </w:r>
-      <w:r>
-        <w:t>Qué sale al aula virtual y si las notas regresan</w:t>
+        <w:t xml:space="preserve">E21  </w:t>
+      </w:r>
+      <w:r>
+        <w:t>Certificados y documentos del alumno</w:t>
       </w:r>
     </w:p>
     <w:p>
@@ -2794,21 +2686,65 @@
           <w:b w:val="0"/>
           <w:i w:val="0"/>
         </w:rPr>
-        <w:t xml:space="preserve">Aula virtual: ¿las </w:t>
+        <w:t xml:space="preserve">(A) ¿Banner </w:t>
       </w:r>
       <w:r>
         <w:rPr>
           <w:b/>
           <w:i w:val="0"/>
         </w:rPr>
-        <w:t>notas regresan</w:t>
+        <w:t>genera el certificado</w:t>
       </w:r>
       <w:r>
         <w:rPr>
           <w:b w:val="0"/>
           <w:i w:val="0"/>
         </w:rPr>
-        <w:t xml:space="preserve"> a Banner? ¿Qué datos salen (NRC, docente, participantes, plan de evaluación)?</w:t>
+        <w:t xml:space="preserve"> (reporte o plantilla) o se hace fuera? (b) ¿El servicio </w:t>
+      </w:r>
+      <w:r>
+        <w:rPr>
+          <w:rFonts w:ascii="Consolas" w:hAnsi="Consolas"/>
+          <w:b w:val="0"/>
+          <w:i w:val="0"/>
+          <w:sz w:val="19"/>
+        </w:rPr>
+        <w:t>CER</w:t>
+      </w:r>
+      <w:r>
+        <w:rPr>
+          <w:b w:val="0"/>
+          <w:i w:val="0"/>
+        </w:rPr>
+        <w:t xml:space="preserve"> </w:t>
+      </w:r>
+      <w:r>
+        <w:rPr>
+          <w:b/>
+          <w:i w:val="0"/>
+        </w:rPr>
+        <w:t>cobra</w:t>
+      </w:r>
+      <w:r>
+        <w:rPr>
+          <w:b w:val="0"/>
+          <w:i w:val="0"/>
+        </w:rPr>
+        <w:t xml:space="preserve"> al pedirlo? (c) ¿Dónde se </w:t>
+      </w:r>
+      <w:r>
+        <w:rPr>
+          <w:b/>
+          <w:i w:val="0"/>
+        </w:rPr>
+        <w:t>guardan los documentos</w:t>
+      </w:r>
+      <w:r>
+        <w:rPr>
+          <w:b w:val="0"/>
+          <w:i w:val="0"/>
+        </w:rPr>
+        <w:t xml:space="preserve"> del alumno (certificados, carpeta de grado)? ¿Hay un gestor documental conectado a Banner? ¿Quién los sube? (d) ¿Habrá un certificado propio de los Centros?</w:t>
       </w:r>
     </w:p>
     <w:p>
@@ -2831,7 +2767,25 @@
           <w:color w:val="4A4458"/>
           <w:sz w:val="19"/>
         </w:rPr>
-        <w:t>El NRC se vincula con el campo «Socio de integración» de SSASECT; los datos del NRC salen al aula virtual (R06; 6.2.4, diap. 10 a 14).</w:t>
+        <w:t>El certificado es una solicitud de servicio (CER) que el alumno crea en el Autoservicio y el área atiende en SVASVPR</w:t>
+      </w:r>
+      <w:r>
+        <w:rPr>
+          <w:b w:val="0"/>
+          <w:i/>
+          <w:color w:val="6B6478"/>
+          <w:sz w:val="19"/>
+        </w:rPr>
+        <w:t xml:space="preserve"> (administración de solicitudes de servicio)</w:t>
+      </w:r>
+      <w:r>
+        <w:rPr>
+          <w:b w:val="0"/>
+          <w:i w:val="0"/>
+          <w:color w:val="4A4458"/>
+          <w:sz w:val="19"/>
+        </w:rPr>
+        <w:t>; se validó con Computación (C44, R20).</w:t>
       </w:r>
     </w:p>
     <w:tbl>
@@ -2895,28 +2849,20 @@
     </w:p>
     <w:p>
       <w:pPr>
-        <w:pStyle w:val="Heading2"/>
-      </w:pPr>
-      <w:r>
-        <w:t>Solicitudes, certificados y seguimiento</w:t>
+        <w:pStyle w:val="Heading3"/>
+      </w:pPr>
+      <w:r>
+        <w:rPr>
+          <w:color w:val="7030A0"/>
+        </w:rPr>
+        <w:t xml:space="preserve">E10  </w:t>
+      </w:r>
+      <w:r>
+        <w:t>Certificado de los centros como grado</w:t>
       </w:r>
     </w:p>
     <w:p>
       <w:pPr>
-        <w:pStyle w:val="Heading3"/>
-      </w:pPr>
-      <w:r>
-        <w:rPr>
-          <w:color w:val="7030A0"/>
-        </w:rPr>
-        <w:t xml:space="preserve">E21  </w:t>
-      </w:r>
-      <w:r>
-        <w:t>Certificados y documentos del alumno</w:t>
-      </w:r>
-    </w:p>
-    <w:p>
-      <w:pPr>
         <w:keepNext/>
       </w:pPr>
       <w:r>
@@ -2924,106 +2870,22 @@
           <w:b w:val="0"/>
           <w:i w:val="0"/>
         </w:rPr>
-        <w:t xml:space="preserve">(A) ¿Banner </w:t>
-      </w:r>
-      <w:r>
-        <w:rPr>
-          <w:b/>
-          <w:i w:val="0"/>
-        </w:rPr>
-        <w:t>genera el certificado</w:t>
-      </w:r>
-      <w:r>
-        <w:rPr>
-          <w:b w:val="0"/>
-          <w:i w:val="0"/>
-        </w:rPr>
-        <w:t xml:space="preserve"> (reporte o plantilla) o se hace fuera? (b) ¿El servicio </w:t>
-      </w:r>
-      <w:r>
-        <w:rPr>
-          <w:rFonts w:ascii="Consolas" w:hAnsi="Consolas"/>
-          <w:b w:val="0"/>
-          <w:i w:val="0"/>
-          <w:sz w:val="19"/>
-        </w:rPr>
-        <w:t>CER</w:t>
-      </w:r>
-      <w:r>
-        <w:rPr>
-          <w:b w:val="0"/>
-          <w:i w:val="0"/>
-        </w:rPr>
-        <w:t xml:space="preserve"> </w:t>
-      </w:r>
-      <w:r>
-        <w:rPr>
-          <w:b/>
-          <w:i w:val="0"/>
-        </w:rPr>
-        <w:t>cobra</w:t>
-      </w:r>
-      <w:r>
-        <w:rPr>
-          <w:b w:val="0"/>
-          <w:i w:val="0"/>
-        </w:rPr>
-        <w:t xml:space="preserve"> al pedirlo? (c) ¿Dónde se </w:t>
-      </w:r>
-      <w:r>
-        <w:rPr>
-          <w:b/>
-          <w:i w:val="0"/>
-        </w:rPr>
-        <w:t>guardan los documentos</w:t>
-      </w:r>
-      <w:r>
-        <w:rPr>
-          <w:b w:val="0"/>
-          <w:i w:val="0"/>
-        </w:rPr>
-        <w:t xml:space="preserve"> del alumno (certificados, carpeta de grado)? ¿Hay un gestor documental conectado a Banner? ¿Quién los sube? (d) ¿Habrá un certificado propio de los Centros?</w:t>
-      </w:r>
-    </w:p>
-    <w:p>
-      <w:pPr>
-        <w:keepNext/>
-        <w:ind w:left="170"/>
-      </w:pPr>
-      <w:r>
-        <w:rPr>
-          <w:b/>
-          <w:color w:val="4EA72E"/>
-          <w:sz w:val="19"/>
-        </w:rPr>
-        <w:t xml:space="preserve">Lo que ya sabemos: </w:t>
-      </w:r>
-      <w:r>
-        <w:rPr>
-          <w:b w:val="0"/>
-          <w:i w:val="0"/>
-          <w:color w:val="4A4458"/>
-          <w:sz w:val="19"/>
-        </w:rPr>
-        <w:t>El certificado es una solicitud de servicio (CER) que el alumno crea en el Autoservicio y el área atiende en SVASVPR</w:t>
+        <w:t>¿El certificado de los centros se registra como grado (SHADEGR</w:t>
       </w:r>
       <w:r>
         <w:rPr>
           <w:b w:val="0"/>
           <w:i/>
           <w:color w:val="6B6478"/>
-          <w:sz w:val="19"/>
-        </w:rPr>
-        <w:t xml:space="preserve"> (administración de solicitudes de servicio)</w:t>
+        </w:rPr>
+        <w:t xml:space="preserve"> (grado del estudiante)</w:t>
       </w:r>
       <w:r>
         <w:rPr>
           <w:b w:val="0"/>
           <w:i w:val="0"/>
-          <w:color w:val="4A4458"/>
-          <w:sz w:val="19"/>
-        </w:rPr>
-        <w:t>; se validó con Computación (C44, R20).</w:t>
+        </w:rPr>
+        <w:t>)?</w:t>
       </w:r>
     </w:p>
     <w:tbl>
@@ -3093,10 +2955,10 @@
         <w:rPr>
           <w:color w:val="7030A0"/>
         </w:rPr>
-        <w:t xml:space="preserve">E10  </w:t>
-      </w:r>
-      <w:r>
-        <w:t>Certificado de los centros como grado</w:t>
+        <w:t xml:space="preserve">E17  </w:t>
+      </w:r>
+      <w:r>
+        <w:t>Aviso por correo y derivación a Gobierno de Personas</w:t>
       </w:r>
     </w:p>
     <w:p>
@@ -3108,22 +2970,48 @@
           <w:b w:val="0"/>
           <w:i w:val="0"/>
         </w:rPr>
-        <w:t>¿El certificado de los centros se registra como grado (SHADEGR</w:t>
+        <w:t>¿Las solicitudes de servicio pueden avisar por correo o asignarse a Gobierno de Personas? ¿Hay integración con su sistema?</w:t>
+      </w:r>
+    </w:p>
+    <w:p>
+      <w:pPr>
+        <w:keepNext/>
+        <w:ind w:left="170"/>
+      </w:pPr>
+      <w:r>
+        <w:rPr>
+          <w:b/>
+          <w:color w:val="4EA72E"/>
+          <w:sz w:val="19"/>
+        </w:rPr>
+        <w:t xml:space="preserve">Lo que ya sabemos: </w:t>
+      </w:r>
+      <w:r>
+        <w:rPr>
+          <w:b w:val="0"/>
+          <w:i w:val="0"/>
+          <w:color w:val="4A4458"/>
+          <w:sz w:val="19"/>
+        </w:rPr>
+        <w:t>Una queja se registra como solicitud de servicio (R14). En SVVSRVC</w:t>
       </w:r>
       <w:r>
         <w:rPr>
           <w:b w:val="0"/>
           <w:i/>
           <w:color w:val="6B6478"/>
-        </w:rPr>
-        <w:t xml:space="preserve"> (grado del estudiante)</w:t>
+          <w:sz w:val="19"/>
+        </w:rPr>
+        <w:t xml:space="preserve"> (catálogo de solicitudes de servicio)</w:t>
       </w:r>
       <w:r>
         <w:rPr>
           <w:b w:val="0"/>
           <w:i w:val="0"/>
-        </w:rPr>
-        <w:t>)?</w:t>
+          <w:color w:val="4A4458"/>
+          <w:sz w:val="19"/>
+        </w:rPr>
+        <w:t xml:space="preserve"> hay 17 servicios y ninguno es de queja (C44).</w:t>
       </w:r>
     </w:p>
     <w:tbl>
@@ -3193,10 +3081,10 @@
         <w:rPr>
           <w:color w:val="7030A0"/>
         </w:rPr>
-        <w:t xml:space="preserve">E17  </w:t>
-      </w:r>
-      <w:r>
-        <w:t>Aviso por correo y derivación a Gobierno de Personas</w:t>
+        <w:t xml:space="preserve">E18  </w:t>
+      </w:r>
+      <w:r>
+        <w:t>Quién atiende cada servicio y confidencialidad</w:t>
       </w:r>
     </w:p>
     <w:p>
@@ -3208,48 +3096,7 @@
           <w:b w:val="0"/>
           <w:i w:val="0"/>
         </w:rPr>
-        <w:t>¿Las solicitudes de servicio pueden avisar por correo o asignarse a Gobierno de Personas? ¿Hay integración con su sistema?</w:t>
-      </w:r>
-    </w:p>
-    <w:p>
-      <w:pPr>
-        <w:keepNext/>
-        <w:ind w:left="170"/>
-      </w:pPr>
-      <w:r>
-        <w:rPr>
-          <w:b/>
-          <w:color w:val="4EA72E"/>
-          <w:sz w:val="19"/>
-        </w:rPr>
-        <w:t xml:space="preserve">Lo que ya sabemos: </w:t>
-      </w:r>
-      <w:r>
-        <w:rPr>
-          <w:b w:val="0"/>
-          <w:i w:val="0"/>
-          <w:color w:val="4A4458"/>
-          <w:sz w:val="19"/>
-        </w:rPr>
-        <w:t>Una queja se registra como solicitud de servicio (R14). En SVVSRVC</w:t>
-      </w:r>
-      <w:r>
-        <w:rPr>
-          <w:b w:val="0"/>
-          <w:i/>
-          <w:color w:val="6B6478"/>
-          <w:sz w:val="19"/>
-        </w:rPr>
-        <w:t xml:space="preserve"> (catálogo de solicitudes de servicio)</w:t>
-      </w:r>
-      <w:r>
-        <w:rPr>
-          <w:b w:val="0"/>
-          <w:i w:val="0"/>
-          <w:color w:val="4A4458"/>
-          <w:sz w:val="19"/>
-        </w:rPr>
-        <w:t xml:space="preserve"> hay 17 servicios y ninguno es de queja (C44).</w:t>
+        <w:t>¿Cómo se define quién atiende cada servicio y quién puede ver una queja (confidencialidad)?</w:t>
       </w:r>
     </w:p>
     <w:tbl>
@@ -3319,10 +3166,10 @@
         <w:rPr>
           <w:color w:val="7030A0"/>
         </w:rPr>
-        <w:t xml:space="preserve">E18  </w:t>
-      </w:r>
-      <w:r>
-        <w:t>Quién atiende cada servicio y confidencialidad</w:t>
+        <w:t xml:space="preserve">E19  </w:t>
+      </w:r>
+      <w:r>
+        <w:t>Alertas tempranas por faltas o notas bajas</w:t>
       </w:r>
     </w:p>
     <w:p>
@@ -3334,7 +3181,48 @@
           <w:b w:val="0"/>
           <w:i w:val="0"/>
         </w:rPr>
-        <w:t>¿Cómo se define quién atiende cada servicio y quién puede ver una queja (confidencialidad)?</w:t>
+        <w:t>¿Banner tiene alertas tempranas por faltas o notas bajas, o solo reportes y comunicaciones?</w:t>
+      </w:r>
+    </w:p>
+    <w:p>
+      <w:pPr>
+        <w:keepNext/>
+        <w:ind w:left="170"/>
+      </w:pPr>
+      <w:r>
+        <w:rPr>
+          <w:b/>
+          <w:color w:val="4EA72E"/>
+          <w:sz w:val="19"/>
+        </w:rPr>
+        <w:t xml:space="preserve">Lo que ya sabemos: </w:t>
+      </w:r>
+      <w:r>
+        <w:rPr>
+          <w:b w:val="0"/>
+          <w:i w:val="0"/>
+          <w:color w:val="4A4458"/>
+          <w:sz w:val="19"/>
+        </w:rPr>
+        <w:t>Los instructivos traen seguimiento en SPACMNT</w:t>
+      </w:r>
+      <w:r>
+        <w:rPr>
+          <w:b w:val="0"/>
+          <w:i/>
+          <w:color w:val="6B6478"/>
+          <w:sz w:val="19"/>
+        </w:rPr>
+        <w:t xml:space="preserve"> (comentarios de la persona)</w:t>
+      </w:r>
+      <w:r>
+        <w:rPr>
+          <w:b w:val="0"/>
+          <w:i w:val="0"/>
+          <w:color w:val="4A4458"/>
+          <w:sz w:val="19"/>
+        </w:rPr>
+        <w:t>, estado académico y comunicaciones, pero no alertas tempranas (R16).</w:t>
       </w:r>
     </w:p>
     <w:tbl>
@@ -3398,20 +3286,28 @@
     </w:p>
     <w:p>
       <w:pPr>
-        <w:pStyle w:val="Heading3"/>
-      </w:pPr>
-      <w:r>
-        <w:rPr>
-          <w:color w:val="7030A0"/>
-        </w:rPr>
-        <w:t xml:space="preserve">E19  </w:t>
-      </w:r>
-      <w:r>
-        <w:t>Alertas tempranas por faltas o notas bajas</w:t>
+        <w:pStyle w:val="Heading2"/>
+      </w:pPr>
+      <w:r>
+        <w:t>Migración y validación</w:t>
       </w:r>
     </w:p>
     <w:p>
       <w:pPr>
+        <w:pStyle w:val="Heading3"/>
+      </w:pPr>
+      <w:r>
+        <w:rPr>
+          <w:color w:val="7030A0"/>
+        </w:rPr>
+        <w:t xml:space="preserve">E06  </w:t>
+      </w:r>
+      <w:r>
+        <w:t>Historia de los centros en la migración</w:t>
+      </w:r>
+    </w:p>
+    <w:p>
+      <w:pPr>
         <w:keepNext/>
       </w:pPr>
       <w:r>
@@ -3419,48 +3315,7 @@
           <w:b w:val="0"/>
           <w:i w:val="0"/>
         </w:rPr>
-        <w:t>¿Banner tiene alertas tempranas por faltas o notas bajas, o solo reportes y comunicaciones?</w:t>
-      </w:r>
-    </w:p>
-    <w:p>
-      <w:pPr>
-        <w:keepNext/>
-        <w:ind w:left="170"/>
-      </w:pPr>
-      <w:r>
-        <w:rPr>
-          <w:b/>
-          <w:color w:val="4EA72E"/>
-          <w:sz w:val="19"/>
-        </w:rPr>
-        <w:t xml:space="preserve">Lo que ya sabemos: </w:t>
-      </w:r>
-      <w:r>
-        <w:rPr>
-          <w:b w:val="0"/>
-          <w:i w:val="0"/>
-          <w:color w:val="4A4458"/>
-          <w:sz w:val="19"/>
-        </w:rPr>
-        <w:t>Los instructivos traen seguimiento en SPACMNT</w:t>
-      </w:r>
-      <w:r>
-        <w:rPr>
-          <w:b w:val="0"/>
-          <w:i/>
-          <w:color w:val="6B6478"/>
-          <w:sz w:val="19"/>
-        </w:rPr>
-        <w:t xml:space="preserve"> (comentarios de la persona)</w:t>
-      </w:r>
-      <w:r>
-        <w:rPr>
-          <w:b w:val="0"/>
-          <w:i w:val="0"/>
-          <w:color w:val="4A4458"/>
-          <w:sz w:val="19"/>
-        </w:rPr>
-        <w:t>, estado académico y comunicaciones, pero no alertas tempranas (R16).</w:t>
+        <w:t>¿Se migra la historia de los centros? ¿A qué periodos de Banner van los cursos llevados en SEUSS?</w:t>
       </w:r>
     </w:p>
     <w:tbl>
@@ -3524,36 +3379,51 @@
     </w:p>
     <w:p>
       <w:pPr>
-        <w:pStyle w:val="Heading2"/>
-      </w:pPr>
-      <w:r>
-        <w:t>Migración y validación</w:t>
+        <w:pStyle w:val="Heading3"/>
+      </w:pPr>
+      <w:r>
+        <w:rPr>
+          <w:color w:val="7030A0"/>
+        </w:rPr>
+        <w:t xml:space="preserve">E07  </w:t>
+      </w:r>
+      <w:r>
+        <w:t>Carga LD01 con equivalencias</w:t>
       </w:r>
     </w:p>
     <w:p>
       <w:pPr>
-        <w:pStyle w:val="Heading3"/>
-      </w:pPr>
-      <w:r>
-        <w:rPr>
-          <w:color w:val="7030A0"/>
-        </w:rPr>
-        <w:t xml:space="preserve">E06  </w:t>
-      </w:r>
-      <w:r>
-        <w:t>Historia de los centros en la migración</w:t>
+        <w:keepNext/>
+      </w:pPr>
+      <w:r>
+        <w:rPr>
+          <w:b w:val="0"/>
+          <w:i w:val="0"/>
+        </w:rPr>
+        <w:t>¿Qué incluye la «Carga LD01 con equivalencias»? ¿Tiene cursos de los centros?</w:t>
       </w:r>
     </w:p>
     <w:p>
       <w:pPr>
         <w:keepNext/>
-      </w:pPr>
+        <w:ind w:left="170"/>
+      </w:pPr>
+      <w:r>
+        <w:rPr>
+          <w:b/>
+          <w:color w:val="4EA72E"/>
+          <w:sz w:val="19"/>
+        </w:rPr>
+        <w:t xml:space="preserve">Lo que ya sabemos: </w:t>
+      </w:r>
       <w:r>
         <w:rPr>
           <w:b w:val="0"/>
           <w:i w:val="0"/>
-        </w:rPr>
-        <w:t>¿Se migra la historia de los centros? ¿A qué periodos de Banner van los cursos llevados en SEUSS?</w:t>
+          <w:color w:val="4A4458"/>
+          <w:sz w:val="19"/>
+        </w:rPr>
+        <w:t>Ellucian indicó que cada fila de equivalencias debe ir con el plan de su modalidad (C58).</w:t>
       </w:r>
     </w:p>
     <w:tbl>
@@ -3623,10 +3493,10 @@
         <w:rPr>
           <w:color w:val="7030A0"/>
         </w:rPr>
-        <w:t xml:space="preserve">E07  </w:t>
-      </w:r>
-      <w:r>
-        <w:t>Carga LD01 con equivalencias</w:t>
+        <w:t xml:space="preserve">E08  </w:t>
+      </w:r>
+      <w:r>
+        <w:t>Alumnos de los centros en la muestra de validación</w:t>
       </w:r>
     </w:p>
     <w:p>
@@ -3638,30 +3508,7 @@
           <w:b w:val="0"/>
           <w:i w:val="0"/>
         </w:rPr>
-        <w:t>¿Qué incluye la «Carga LD01 con equivalencias»? ¿Tiene cursos de los centros?</w:t>
-      </w:r>
-    </w:p>
-    <w:p>
-      <w:pPr>
-        <w:keepNext/>
-        <w:ind w:left="170"/>
-      </w:pPr>
-      <w:r>
-        <w:rPr>
-          <w:b/>
-          <w:color w:val="4EA72E"/>
-          <w:sz w:val="19"/>
-        </w:rPr>
-        <w:t xml:space="preserve">Lo que ya sabemos: </w:t>
-      </w:r>
-      <w:r>
-        <w:rPr>
-          <w:b w:val="0"/>
-          <w:i w:val="0"/>
-          <w:color w:val="4A4458"/>
-          <w:sz w:val="19"/>
-        </w:rPr>
-        <w:t>Ellucian indicó que cada fila de equivalencias debe ir con el plan de su modalidad (C58).</w:t>
+        <w:t>¿La muestra de validación incluye participantes de los centros? ¿Cuántos y quién los elige? (propuesta: 16 por centro)</w:t>
       </w:r>
     </w:p>
     <w:tbl>
@@ -3731,10 +3578,10 @@
         <w:rPr>
           <w:color w:val="7030A0"/>
         </w:rPr>
-        <w:t xml:space="preserve">E08  </w:t>
-      </w:r>
-      <w:r>
-        <w:t>Alumnos de los centros en la muestra de validación</w:t>
+        <w:t xml:space="preserve">E09  </w:t>
+      </w:r>
+      <w:r>
+        <w:t>Quién ejecuta SMARQCM y SFPPROJ en TEST</w:t>
       </w:r>
     </w:p>
     <w:p>
@@ -3746,7 +3593,37 @@
           <w:b w:val="0"/>
           <w:i w:val="0"/>
         </w:rPr>
-        <w:t>¿La muestra de validación incluye participantes de los centros? ¿Cuántos y quién los elige? (propuesta: 16 por centro)</w:t>
+        <w:t>¿Quién ejecuta SMARQCM</w:t>
+      </w:r>
+      <w:r>
+        <w:rPr>
+          <w:b w:val="0"/>
+          <w:i/>
+          <w:color w:val="6B6478"/>
+        </w:rPr>
+        <w:t xml:space="preserve"> (CAPP de un estudiante)</w:t>
+      </w:r>
+      <w:r>
+        <w:rPr>
+          <w:b w:val="0"/>
+          <w:i w:val="0"/>
+        </w:rPr>
+        <w:t xml:space="preserve"> y SFPPROJ</w:t>
+      </w:r>
+      <w:r>
+        <w:rPr>
+          <w:b w:val="0"/>
+          <w:i/>
+          <w:color w:val="6B6478"/>
+        </w:rPr>
+        <w:t xml:space="preserve"> (proceso de proyección académica)</w:t>
+      </w:r>
+      <w:r>
+        <w:rPr>
+          <w:b w:val="0"/>
+          <w:i w:val="0"/>
+        </w:rPr>
+        <w:t xml:space="preserve"> en TEST, Ellucian o la USS? ¿Hay accesos?</w:t>
       </w:r>
     </w:p>
     <w:tbl>
@@ -3816,10 +3693,10 @@
         <w:rPr>
           <w:color w:val="7030A0"/>
         </w:rPr>
-        <w:t xml:space="preserve">E09  </w:t>
-      </w:r>
-      <w:r>
-        <w:t>Quién ejecuta SMARQCM y SFPPROJ en TEST</w:t>
+        <w:t xml:space="preserve">E11  </w:t>
+      </w:r>
+      <w:r>
+        <w:t>Formato del Issue log</w:t>
       </w:r>
     </w:p>
     <w:p>
@@ -3831,37 +3708,7 @@
           <w:b w:val="0"/>
           <w:i w:val="0"/>
         </w:rPr>
-        <w:t>¿Quién ejecuta SMARQCM</w:t>
-      </w:r>
-      <w:r>
-        <w:rPr>
-          <w:b w:val="0"/>
-          <w:i/>
-          <w:color w:val="6B6478"/>
-        </w:rPr>
-        <w:t xml:space="preserve"> (CAPP de un estudiante)</w:t>
-      </w:r>
-      <w:r>
-        <w:rPr>
-          <w:b w:val="0"/>
-          <w:i w:val="0"/>
-        </w:rPr>
-        <w:t xml:space="preserve"> y SFPPROJ</w:t>
-      </w:r>
-      <w:r>
-        <w:rPr>
-          <w:b w:val="0"/>
-          <w:i/>
-          <w:color w:val="6B6478"/>
-        </w:rPr>
-        <w:t xml:space="preserve"> (proceso de proyección académica)</w:t>
-      </w:r>
-      <w:r>
-        <w:rPr>
-          <w:b w:val="0"/>
-          <w:i w:val="0"/>
-        </w:rPr>
-        <w:t xml:space="preserve"> en TEST, Ellucian o la USS? ¿Hay accesos?</w:t>
+        <w:t>¿Cuándo se define el formato del Issue log? ¿Sirve la propuesta de la planilla?</w:t>
       </w:r>
     </w:p>
     <w:tbl>
@@ -3931,10 +3778,10 @@
         <w:rPr>
           <w:color w:val="7030A0"/>
         </w:rPr>
-        <w:t xml:space="preserve">E11  </w:t>
-      </w:r>
-      <w:r>
-        <w:t>Formato del Issue log</w:t>
+        <w:t xml:space="preserve">E12  </w:t>
+      </w:r>
+      <w:r>
+        <w:t>Totales por centro desde Insight</w:t>
       </w:r>
     </w:p>
     <w:p>
@@ -3946,7 +3793,7 @@
           <w:b w:val="0"/>
           <w:i w:val="0"/>
         </w:rPr>
-        <w:t>¿Cuándo se define el formato del Issue log? ¿Sirve la propuesta de la planilla?</w:t>
+        <w:t>¿Insight puede dar los totales por centro para conciliar con SEUSS?</w:t>
       </w:r>
     </w:p>
     <w:tbl>
@@ -4010,28 +3857,76 @@
     </w:p>
     <w:p>
       <w:pPr>
-        <w:pStyle w:val="Heading3"/>
-      </w:pPr>
-      <w:r>
-        <w:rPr>
-          <w:color w:val="7030A0"/>
-        </w:rPr>
-        <w:t xml:space="preserve">E12  </w:t>
-      </w:r>
-      <w:r>
-        <w:t>Totales por centro desde Insight</w:t>
+        <w:spacing w:after="0"/>
+      </w:pPr>
+      <w:r>
+        <w:br w:type="page"/>
       </w:r>
     </w:p>
     <w:p>
       <w:pPr>
-        <w:keepNext/>
-      </w:pPr>
+        <w:pStyle w:val="Heading1"/>
+      </w:pPr>
+      <w:r>
+        <w:t>2. Para la USS (preparar con los jefes)</w:t>
+      </w:r>
+    </w:p>
+    <w:p>
       <w:r>
         <w:rPr>
           <w:b w:val="0"/>
           <w:i w:val="0"/>
-        </w:rPr>
-        <w:t>¿Insight puede dar los totales por centro para conciliar con SEUSS?</w:t>
+          <w:color w:val="6B6478"/>
+        </w:rPr>
+        <w:t>No son para Ellucian, pero sus respuestas definen datos de Banner. Conviene tenerlas a la mano en la reunión.</w:t>
+      </w:r>
+    </w:p>
+    <w:p>
+      <w:pPr>
+        <w:pStyle w:val="Heading2"/>
+      </w:pPr>
+      <w:r>
+        <w:t>Reglas académicas</w:t>
+      </w:r>
+    </w:p>
+    <w:p>
+      <w:pPr>
+        <w:pStyle w:val="Heading3"/>
+      </w:pPr>
+      <w:r>
+        <w:rPr>
+          <w:color w:val="7030A0"/>
+        </w:rPr>
+        <w:t xml:space="preserve">U01  </w:t>
+      </w:r>
+      <w:r>
+        <w:t>Puntaje mínimo del examen de suficiencia de Inglés</w:t>
+      </w:r>
+    </w:p>
+    <w:p>
+      <w:pPr>
+        <w:keepNext/>
+      </w:pPr>
+      <w:r>
+        <w:rPr>
+          <w:b w:val="0"/>
+          <w:i w:val="0"/>
+        </w:rPr>
+        <w:t xml:space="preserve">Examen de suficiencia de Inglés: ¿qué </w:t>
+      </w:r>
+      <w:r>
+        <w:rPr>
+          <w:b/>
+          <w:i w:val="0"/>
+        </w:rPr>
+        <w:t>puntaje mínimo</w:t>
+      </w:r>
+      <w:r>
+        <w:rPr>
+          <w:b w:val="0"/>
+          <w:i w:val="0"/>
+        </w:rPr>
+        <w:t xml:space="preserve"> se exige y quién lo registra en Banner (SOATEST)? La regla ya está confirmada (C11).</w:t>
       </w:r>
     </w:p>
     <w:tbl>
@@ -4095,76 +3990,28 @@
     </w:p>
     <w:p>
       <w:pPr>
-        <w:spacing w:after="0"/>
-      </w:pPr>
-      <w:r>
-        <w:br w:type="page"/>
+        <w:pStyle w:val="Heading3"/>
+      </w:pPr>
+      <w:r>
+        <w:rPr>
+          <w:color w:val="7030A0"/>
+        </w:rPr>
+        <w:t xml:space="preserve">U21  </w:t>
+      </w:r>
+      <w:r>
+        <w:t>¿Emprendimiento rinde examen de suficiencia?</w:t>
       </w:r>
     </w:p>
     <w:p>
       <w:pPr>
-        <w:pStyle w:val="Heading1"/>
-      </w:pPr>
-      <w:r>
-        <w:t>2. Para la USS (preparar con los jefes)</w:t>
-      </w:r>
-    </w:p>
-    <w:p>
+        <w:keepNext/>
+      </w:pPr>
       <w:r>
         <w:rPr>
           <w:b w:val="0"/>
           <w:i w:val="0"/>
-          <w:color w:val="6B6478"/>
-        </w:rPr>
-        <w:t>No son para Ellucian, pero sus respuestas definen datos de Banner. Conviene tenerlas a la mano en la reunión.</w:t>
-      </w:r>
-    </w:p>
-    <w:p>
-      <w:pPr>
-        <w:pStyle w:val="Heading2"/>
-      </w:pPr>
-      <w:r>
-        <w:t>Reglas académicas</w:t>
-      </w:r>
-    </w:p>
-    <w:p>
-      <w:pPr>
-        <w:pStyle w:val="Heading3"/>
-      </w:pPr>
-      <w:r>
-        <w:rPr>
-          <w:color w:val="7030A0"/>
-        </w:rPr>
-        <w:t xml:space="preserve">U01  </w:t>
-      </w:r>
-      <w:r>
-        <w:t>Puntaje mínimo del examen de suficiencia de Inglés</w:t>
-      </w:r>
-    </w:p>
-    <w:p>
-      <w:pPr>
-        <w:keepNext/>
-      </w:pPr>
-      <w:r>
-        <w:rPr>
-          <w:b w:val="0"/>
-          <w:i w:val="0"/>
-        </w:rPr>
-        <w:t xml:space="preserve">Examen de suficiencia de Inglés: ¿qué </w:t>
-      </w:r>
-      <w:r>
-        <w:rPr>
-          <w:b/>
-          <w:i w:val="0"/>
-        </w:rPr>
-        <w:t>puntaje mínimo</w:t>
-      </w:r>
-      <w:r>
-        <w:rPr>
-          <w:b w:val="0"/>
-          <w:i w:val="0"/>
-        </w:rPr>
-        <w:t xml:space="preserve"> se exige y quién lo registra en Banner (SOATEST)? La regla ya está confirmada (C11).</w:t>
+        </w:rPr>
+        <w:t>¿El Centro de Emprendimiento rinde examen de suficiencia para acreditar o exonerar módulos, o solo aplica a Idiomas?</w:t>
       </w:r>
     </w:p>
     <w:tbl>
@@ -4234,10 +4081,10 @@
         <w:rPr>
           <w:color w:val="7030A0"/>
         </w:rPr>
-        <w:t xml:space="preserve">U21  </w:t>
-      </w:r>
-      <w:r>
-        <w:t>¿Emprendimiento rinde examen de suficiencia?</w:t>
+        <w:t xml:space="preserve">U02  </w:t>
+      </w:r>
+      <w:r>
+        <w:t>Secuencia de cursos en Emprendimiento</w:t>
       </w:r>
     </w:p>
     <w:p>
@@ -4249,7 +4096,21 @@
           <w:b w:val="0"/>
           <w:i w:val="0"/>
         </w:rPr>
-        <w:t>¿El Centro de Emprendimiento rinde examen de suficiencia para acreditar o exonerar módulos, o solo aplica a Idiomas?</w:t>
+        <w:t xml:space="preserve">En Idiomas y Computación ya se definió la secuencia (C62). ¿En </w:t>
+      </w:r>
+      <w:r>
+        <w:rPr>
+          <w:b/>
+          <w:i w:val="0"/>
+        </w:rPr>
+        <w:t>Emprendimiento</w:t>
+      </w:r>
+      <w:r>
+        <w:rPr>
+          <w:b w:val="0"/>
+          <w:i w:val="0"/>
+        </w:rPr>
+        <w:t xml:space="preserve"> el alumno debe aprobar el módulo I para llevar el II y el III, o puede llevarlos en cualquier orden?</w:t>
       </w:r>
     </w:p>
     <w:tbl>
@@ -4319,10 +4180,10 @@
         <w:rPr>
           <w:color w:val="7030A0"/>
         </w:rPr>
-        <w:t xml:space="preserve">U02  </w:t>
-      </w:r>
-      <w:r>
-        <w:t>Secuencia de cursos en Emprendimiento</w:t>
+        <w:t xml:space="preserve">U09  </w:t>
+      </w:r>
+      <w:r>
+        <w:t>Nombres de las horas (pedagógica y cronológica)</w:t>
       </w:r>
     </w:p>
     <w:p>
@@ -4331,24 +4192,17 @@
       </w:pPr>
       <w:r>
         <w:rPr>
+          <w:b/>
+          <w:i w:val="0"/>
+        </w:rPr>
+        <w:t>Nombres de las horas.</w:t>
+      </w:r>
+      <w:r>
+        <w:rPr>
           <w:b w:val="0"/>
           <w:i w:val="0"/>
         </w:rPr>
-        <w:t xml:space="preserve">En Idiomas y Computación ya se definió la secuencia (C62). ¿En </w:t>
-      </w:r>
-      <w:r>
-        <w:rPr>
-          <w:b/>
-          <w:i w:val="0"/>
-        </w:rPr>
-        <w:t>Emprendimiento</w:t>
-      </w:r>
-      <w:r>
-        <w:rPr>
-          <w:b w:val="0"/>
-          <w:i w:val="0"/>
-        </w:rPr>
-        <w:t xml:space="preserve"> el alumno debe aprobar el módulo I para llevar el II y el III, o puede llevarlos en cualquier orden?</w:t>
+        <w:t xml:space="preserve"> El 26/09 el usuario dijo «pedagógica = presencial, 60 min» y «cronológica = 45 min de día / 50 de noche = 1 hora». En su nota del Zoom estaba al revés («40–45 / 50 min → h. académicas; 1 hora → h. cronológicas»), y en el uso común la hora pedagógica es la de 45/50 y la cronológica la de 60. En los PDF se usan sus nombres, siempre con los minutos al lado. Confirmar.</w:t>
       </w:r>
     </w:p>
     <w:tbl>
@@ -4412,35 +4266,100 @@
     </w:p>
     <w:p>
       <w:pPr>
-        <w:pStyle w:val="Heading3"/>
-      </w:pPr>
-      <w:r>
-        <w:rPr>
-          <w:color w:val="7030A0"/>
-        </w:rPr>
-        <w:t xml:space="preserve">U09  </w:t>
-      </w:r>
-      <w:r>
-        <w:t>Nombres de las horas (pedagógica y cronológica)</w:t>
+        <w:pStyle w:val="Heading2"/>
+      </w:pPr>
+      <w:r>
+        <w:t>Programas, mallas y catálogo</w:t>
       </w:r>
     </w:p>
     <w:p>
       <w:pPr>
+        <w:pStyle w:val="Heading3"/>
+      </w:pPr>
+      <w:r>
+        <w:rPr>
+          <w:color w:val="7030A0"/>
+        </w:rPr>
+        <w:t xml:space="preserve">U31  </w:t>
+      </w:r>
+      <w:r>
+        <w:t>¿CMEMC44 o CMEMC38 para Diseño Web?</w:t>
+      </w:r>
+    </w:p>
+    <w:p>
+      <w:pPr>
         <w:keepNext/>
       </w:pPr>
-      <w:r>
-        <w:rPr>
-          <w:b/>
-          <w:i w:val="0"/>
-        </w:rPr>
-        <w:t>Nombres de las horas.</w:t>
-      </w:r>
       <w:r>
         <w:rPr>
           <w:b w:val="0"/>
           <w:i w:val="0"/>
         </w:rPr>
-        <w:t xml:space="preserve"> El 26/09 el usuario dijo «pedagógica = presencial, 60 min» y «cronológica = 45 min de día / 50 de noche = 1 hora». En su nota del Zoom estaba al revés («40–45 / 50 min → h. académicas; 1 hora → h. cronológicas»), y en el uso común la hora pedagógica es la de 45/50 y la cronológica la de 60. En los PDF se usan sus nombres, siempre con los minutos al lado. Confirmar.</w:t>
+        <w:t xml:space="preserve">La hoja de NRC 202656 y los alumnos de prueba usan </w:t>
+      </w:r>
+      <w:r>
+        <w:rPr>
+          <w:rFonts w:ascii="Consolas" w:hAnsi="Consolas"/>
+          <w:b w:val="0"/>
+          <w:i w:val="0"/>
+          <w:sz w:val="19"/>
+        </w:rPr>
+        <w:t>CMEMC38</w:t>
+      </w:r>
+      <w:r>
+        <w:rPr>
+          <w:b w:val="0"/>
+          <w:i w:val="0"/>
+        </w:rPr>
+        <w:t xml:space="preserve"> «Acreditación Computación XP 01» (malla MC38-01, regla ECOM-01), pero al alumno </w:t>
+      </w:r>
+      <w:r>
+        <w:rPr>
+          <w:rFonts w:ascii="Consolas" w:hAnsi="Consolas"/>
+          <w:b w:val="0"/>
+          <w:i w:val="0"/>
+          <w:sz w:val="19"/>
+        </w:rPr>
+        <w:t>100582059</w:t>
+      </w:r>
+      <w:r>
+        <w:rPr>
+          <w:b w:val="0"/>
+          <w:i w:val="0"/>
+        </w:rPr>
+        <w:t xml:space="preserve"> se le dio </w:t>
+      </w:r>
+      <w:r>
+        <w:rPr>
+          <w:rFonts w:ascii="Consolas" w:hAnsi="Consolas"/>
+          <w:b w:val="0"/>
+          <w:i w:val="0"/>
+          <w:sz w:val="19"/>
+        </w:rPr>
+        <w:t>CMEMC44</w:t>
+      </w:r>
+      <w:r>
+        <w:rPr>
+          <w:b w:val="0"/>
+          <w:i w:val="0"/>
+        </w:rPr>
+        <w:t xml:space="preserve"> «Acreditación Computación XP 07» (C100). ¿Qué distingue a XP 01 de XP 07 y cuál corresponde a Diseño Web (</w:t>
+      </w:r>
+      <w:r>
+        <w:rPr>
+          <w:rFonts w:ascii="Consolas" w:hAnsi="Consolas"/>
+          <w:b w:val="0"/>
+          <w:i w:val="0"/>
+          <w:sz w:val="19"/>
+        </w:rPr>
+        <w:t>ESEC 00684</w:t>
+      </w:r>
+      <w:r>
+        <w:rPr>
+          <w:b w:val="0"/>
+          <w:i w:val="0"/>
+        </w:rPr>
+        <w:t>)? No bloquea la matrícula, pero sí el CAPP.</w:t>
       </w:r>
     </w:p>
     <w:tbl>
@@ -4504,37 +4423,22 @@
     </w:p>
     <w:p>
       <w:pPr>
-        <w:pStyle w:val="Heading2"/>
-      </w:pPr>
-      <w:r>
-        <w:t>Programas, mallas y catálogo</w:t>
+        <w:pStyle w:val="Heading3"/>
+      </w:pPr>
+      <w:r>
+        <w:rPr>
+          <w:color w:val="7030A0"/>
+        </w:rPr>
+        <w:t xml:space="preserve">U19  </w:t>
+      </w:r>
+      <w:r>
+        <w:t>Programa MC38 y regla ECOM-01</w:t>
       </w:r>
     </w:p>
     <w:p>
       <w:pPr>
-        <w:pStyle w:val="Heading3"/>
-      </w:pPr>
-      <w:r>
-        <w:rPr>
-          <w:color w:val="7030A0"/>
-        </w:rPr>
-        <w:t xml:space="preserve">U31  </w:t>
-      </w:r>
-      <w:r>
-        <w:t>¿CMEMC44 o CMEMC38 para Diseño Web?</w:t>
-      </w:r>
-    </w:p>
-    <w:p>
-      <w:pPr>
         <w:keepNext/>
       </w:pPr>
-      <w:r>
-        <w:rPr>
-          <w:b w:val="0"/>
-          <w:i w:val="0"/>
-        </w:rPr>
-        <w:t xml:space="preserve">La hoja de NRC 202656 y los alumnos de prueba usan </w:t>
-      </w:r>
       <w:r>
         <w:rPr>
           <w:rFonts w:ascii="Consolas" w:hAnsi="Consolas"/>
@@ -4549,7 +4453,7 @@
           <w:b w:val="0"/>
           <w:i w:val="0"/>
         </w:rPr>
-        <w:t xml:space="preserve"> «Acreditación Computación XP 01» (malla MC38-01, regla ECOM-01), pero al alumno </w:t>
+        <w:t xml:space="preserve"> y el nivel </w:t>
       </w:r>
       <w:r>
         <w:rPr>
@@ -4558,46 +4462,42 @@
           <w:i w:val="0"/>
           <w:sz w:val="19"/>
         </w:rPr>
-        <w:t>100582059</w:t>
+        <w:t>C</w:t>
       </w:r>
       <w:r>
         <w:rPr>
           <w:b w:val="0"/>
           <w:i w:val="0"/>
         </w:rPr>
-        <w:t xml:space="preserve"> se le dio </w:t>
-      </w:r>
-      <w:r>
-        <w:rPr>
-          <w:rFonts w:ascii="Consolas" w:hAnsi="Consolas"/>
+        <w:t xml:space="preserve"> ya están confirmados. ¿Qué programa es </w:t>
+      </w:r>
+      <w:r>
+        <w:rPr>
+          <w:b/>
+          <w:i w:val="0"/>
+        </w:rPr>
+        <w:t>MC38</w:t>
+      </w:r>
+      <w:r>
+        <w:rPr>
           <w:b w:val="0"/>
           <w:i w:val="0"/>
-          <w:sz w:val="19"/>
-        </w:rPr>
-        <w:t>CMEMC44</w:t>
+        </w:rPr>
+        <w:t xml:space="preserve"> en SMAAREA y la regla </w:t>
+      </w:r>
+      <w:r>
+        <w:rPr>
+          <w:b/>
+          <w:i w:val="0"/>
+        </w:rPr>
+        <w:t>ECOM-01</w:t>
       </w:r>
       <w:r>
         <w:rPr>
           <w:b w:val="0"/>
           <w:i w:val="0"/>
         </w:rPr>
-        <w:t xml:space="preserve"> «Acreditación Computación XP 07» (C100). ¿Qué distingue a XP 01 de XP 07 y cuál corresponde a Diseño Web (</w:t>
-      </w:r>
-      <w:r>
-        <w:rPr>
-          <w:rFonts w:ascii="Consolas" w:hAnsi="Consolas"/>
-          <w:b w:val="0"/>
-          <w:i w:val="0"/>
-          <w:sz w:val="19"/>
-        </w:rPr>
-        <w:t>ESEC 00684</w:t>
-      </w:r>
-      <w:r>
-        <w:rPr>
-          <w:b w:val="0"/>
-          <w:i w:val="0"/>
-        </w:rPr>
-        <w:t>)? No bloquea la matrícula, pero sí el CAPP.</w:t>
+        <w:t xml:space="preserve"> es el requisito de computación de pregrado?</w:t>
       </w:r>
     </w:p>
     <w:tbl>
@@ -4667,16 +4567,37 @@
         <w:rPr>
           <w:color w:val="7030A0"/>
         </w:rPr>
-        <w:t xml:space="preserve">U19  </w:t>
-      </w:r>
-      <w:r>
-        <w:t>Programa MC38 y regla ECOM-01</w:t>
+        <w:t xml:space="preserve">U05  </w:t>
+      </w:r>
+      <w:r>
+        <w:t>Nombres de los cursos de Emprendimiento en el catálogo</w:t>
       </w:r>
     </w:p>
     <w:p>
       <w:pPr>
         <w:keepNext/>
       </w:pPr>
+      <w:r>
+        <w:rPr>
+          <w:b w:val="0"/>
+          <w:i w:val="0"/>
+        </w:rPr>
+        <w:t xml:space="preserve">En Idiomas y Computación los cursos ya están confirmados. ¿Cuáles son los nombres y códigos de los cursos de </w:t>
+      </w:r>
+      <w:r>
+        <w:rPr>
+          <w:b/>
+          <w:i w:val="0"/>
+        </w:rPr>
+        <w:t>Emprendimiento</w:t>
+      </w:r>
+      <w:r>
+        <w:rPr>
+          <w:b w:val="0"/>
+          <w:i w:val="0"/>
+        </w:rPr>
+        <w:t xml:space="preserve"> (</w:t>
+      </w:r>
       <w:r>
         <w:rPr>
           <w:rFonts w:ascii="Consolas" w:hAnsi="Consolas"/>
@@ -4684,58 +4605,14 @@
           <w:i w:val="0"/>
           <w:sz w:val="19"/>
         </w:rPr>
-        <w:t>CMEMC38</w:t>
+        <w:t>ESGE</w:t>
       </w:r>
       <w:r>
         <w:rPr>
           <w:b w:val="0"/>
           <w:i w:val="0"/>
         </w:rPr>
-        <w:t xml:space="preserve"> y el nivel </w:t>
-      </w:r>
-      <w:r>
-        <w:rPr>
-          <w:rFonts w:ascii="Consolas" w:hAnsi="Consolas"/>
-          <w:b w:val="0"/>
-          <w:i w:val="0"/>
-          <w:sz w:val="19"/>
-        </w:rPr>
-        <w:t>C</w:t>
-      </w:r>
-      <w:r>
-        <w:rPr>
-          <w:b w:val="0"/>
-          <w:i w:val="0"/>
-        </w:rPr>
-        <w:t xml:space="preserve"> ya están confirmados. ¿Qué programa es </w:t>
-      </w:r>
-      <w:r>
-        <w:rPr>
-          <w:b/>
-          <w:i w:val="0"/>
-        </w:rPr>
-        <w:t>MC38</w:t>
-      </w:r>
-      <w:r>
-        <w:rPr>
-          <w:b w:val="0"/>
-          <w:i w:val="0"/>
-        </w:rPr>
-        <w:t xml:space="preserve"> en SMAAREA y la regla </w:t>
-      </w:r>
-      <w:r>
-        <w:rPr>
-          <w:b/>
-          <w:i w:val="0"/>
-        </w:rPr>
-        <w:t>ECOM-01</w:t>
-      </w:r>
-      <w:r>
-        <w:rPr>
-          <w:b w:val="0"/>
-          <w:i w:val="0"/>
-        </w:rPr>
-        <w:t xml:space="preserve"> es el requisito de computación de pregrado?</w:t>
+        <w:t>) en el catálogo de Banner?</w:t>
       </w:r>
     </w:p>
     <w:tbl>
@@ -4805,10 +4682,10 @@
         <w:rPr>
           <w:color w:val="7030A0"/>
         </w:rPr>
-        <w:t xml:space="preserve">U05  </w:t>
-      </w:r>
-      <w:r>
-        <w:t>Nombres de los cursos de Emprendimiento en el catálogo</w:t>
+        <w:t xml:space="preserve">U12  </w:t>
+      </w:r>
+      <w:r>
+        <w:t>Planes en rediseño y de posgrado antes de 20271</w:t>
       </w:r>
     </w:p>
     <w:p>
@@ -4820,37 +4697,7 @@
           <w:b w:val="0"/>
           <w:i w:val="0"/>
         </w:rPr>
-        <w:t xml:space="preserve">En Idiomas y Computación los cursos ya están confirmados. ¿Cuáles son los nombres y códigos de los cursos de </w:t>
-      </w:r>
-      <w:r>
-        <w:rPr>
-          <w:b/>
-          <w:i w:val="0"/>
-        </w:rPr>
-        <w:t>Emprendimiento</w:t>
-      </w:r>
-      <w:r>
-        <w:rPr>
-          <w:b w:val="0"/>
-          <w:i w:val="0"/>
-        </w:rPr>
-        <w:t xml:space="preserve"> (</w:t>
-      </w:r>
-      <w:r>
-        <w:rPr>
-          <w:rFonts w:ascii="Consolas" w:hAnsi="Consolas"/>
-          <w:b w:val="0"/>
-          <w:i w:val="0"/>
-          <w:sz w:val="19"/>
-        </w:rPr>
-        <w:t>ESGE</w:t>
-      </w:r>
-      <w:r>
-        <w:rPr>
-          <w:b w:val="0"/>
-          <w:i w:val="0"/>
-        </w:rPr>
-        <w:t>) en el catálogo de Banner?</w:t>
+        <w:t>¿Quién termina los planes en rediseño y el de posgrado (cursos, versión, equivalencias) y con qué fecha límite antes de 20271?</w:t>
       </w:r>
     </w:p>
     <w:tbl>
@@ -4920,10 +4767,10 @@
         <w:rPr>
           <w:color w:val="7030A0"/>
         </w:rPr>
-        <w:t xml:space="preserve">U12  </w:t>
-      </w:r>
-      <w:r>
-        <w:t>Planes en rediseño y de posgrado antes de 20271</w:t>
+        <w:t xml:space="preserve">U13  </w:t>
+      </w:r>
+      <w:r>
+        <w:t>Código del periodo «20271»</w:t>
       </w:r>
     </w:p>
     <w:p>
@@ -4935,7 +4782,7 @@
           <w:b w:val="0"/>
           <w:i w:val="0"/>
         </w:rPr>
-        <w:t>¿Quién termina los planes en rediseño y el de posgrado (cursos, versión, equivalencias) y con qué fecha límite antes de 20271?</w:t>
+        <w:t>«20271»: ¿es el primer periodo de 2027 de posgrado? ¿Cuál es su código de 6 dígitos?</w:t>
       </w:r>
     </w:p>
     <w:tbl>
@@ -4999,20 +4846,28 @@
     </w:p>
     <w:p>
       <w:pPr>
-        <w:pStyle w:val="Heading3"/>
-      </w:pPr>
-      <w:r>
-        <w:rPr>
-          <w:color w:val="7030A0"/>
-        </w:rPr>
-        <w:t xml:space="preserve">U13  </w:t>
-      </w:r>
-      <w:r>
-        <w:t>Código del periodo «20271»</w:t>
+        <w:pStyle w:val="Heading2"/>
+      </w:pPr>
+      <w:r>
+        <w:t>Matrícula, permisos y egresados</w:t>
       </w:r>
     </w:p>
     <w:p>
       <w:pPr>
+        <w:pStyle w:val="Heading3"/>
+      </w:pPr>
+      <w:r>
+        <w:rPr>
+          <w:color w:val="7030A0"/>
+        </w:rPr>
+        <w:t xml:space="preserve">U10  </w:t>
+      </w:r>
+      <w:r>
+        <w:t>Quién da sobrepasos de prerrequisito</w:t>
+      </w:r>
+    </w:p>
+    <w:p>
+      <w:pPr>
         <w:keepNext/>
       </w:pPr>
       <w:r>
@@ -5020,7 +4875,36 @@
           <w:b w:val="0"/>
           <w:i w:val="0"/>
         </w:rPr>
-        <w:t>«20271»: ¿es el primer periodo de 2027 de posgrado? ¿Cuál es su código de 6 dígitos?</w:t>
+        <w:t xml:space="preserve">¿Quién podrá dar </w:t>
+      </w:r>
+      <w:r>
+        <w:rPr>
+          <w:b/>
+          <w:i w:val="0"/>
+        </w:rPr>
+        <w:t>sobrepasos</w:t>
+      </w:r>
+      <w:r>
+        <w:rPr>
+          <w:b w:val="0"/>
+          <w:i w:val="0"/>
+        </w:rPr>
+        <w:t xml:space="preserve"> de prerrequisito (SFAROVR</w:t>
+      </w:r>
+      <w:r>
+        <w:rPr>
+          <w:b w:val="0"/>
+          <w:i/>
+          <w:color w:val="6B6478"/>
+        </w:rPr>
+        <w:t xml:space="preserve"> (permisos de sobrepaso de inscripción)</w:t>
+      </w:r>
+      <w:r>
+        <w:rPr>
+          <w:b w:val="0"/>
+          <w:i w:val="0"/>
+        </w:rPr>
+        <w:t>)? En SEUSS ese camino no existe.</w:t>
       </w:r>
     </w:p>
     <w:tbl>
@@ -5084,28 +4968,20 @@
     </w:p>
     <w:p>
       <w:pPr>
-        <w:pStyle w:val="Heading2"/>
-      </w:pPr>
-      <w:r>
-        <w:t>Matrícula, permisos y egresados</w:t>
+        <w:pStyle w:val="Heading3"/>
+      </w:pPr>
+      <w:r>
+        <w:rPr>
+          <w:color w:val="7030A0"/>
+        </w:rPr>
+        <w:t xml:space="preserve">U08  </w:t>
+      </w:r>
+      <w:r>
+        <w:t>¿La jefatura autoriza los sobrepasos?</w:t>
       </w:r>
     </w:p>
     <w:p>
       <w:pPr>
-        <w:pStyle w:val="Heading3"/>
-      </w:pPr>
-      <w:r>
-        <w:rPr>
-          <w:color w:val="7030A0"/>
-        </w:rPr>
-        <w:t xml:space="preserve">U10  </w:t>
-      </w:r>
-      <w:r>
-        <w:t>Quién da sobrepasos de prerrequisito</w:t>
-      </w:r>
-    </w:p>
-    <w:p>
-      <w:pPr>
         <w:keepNext/>
       </w:pPr>
       <w:r>
@@ -5113,7 +4989,7 @@
           <w:b w:val="0"/>
           <w:i w:val="0"/>
         </w:rPr>
-        <w:t xml:space="preserve">¿Quién podrá dar </w:t>
+        <w:t xml:space="preserve">El jefe da el visto bueno de la carga lectiva (C47). ¿También autoriza los </w:t>
       </w:r>
       <w:r>
         <w:rPr>
@@ -5127,22 +5003,7 @@
           <w:b w:val="0"/>
           <w:i w:val="0"/>
         </w:rPr>
-        <w:t xml:space="preserve"> de prerrequisito (SFAROVR</w:t>
-      </w:r>
-      <w:r>
-        <w:rPr>
-          <w:b w:val="0"/>
-          <w:i/>
-          <w:color w:val="6B6478"/>
-        </w:rPr>
-        <w:t xml:space="preserve"> (permisos de sobrepaso de inscripción)</w:t>
-      </w:r>
-      <w:r>
-        <w:rPr>
-          <w:b w:val="0"/>
-          <w:i w:val="0"/>
-        </w:rPr>
-        <w:t>)? En SEUSS ese camino no existe.</w:t>
+        <w:t xml:space="preserve"> (SFAROVR)?</w:t>
       </w:r>
     </w:p>
     <w:tbl>
@@ -5212,10 +5073,10 @@
         <w:rPr>
           <w:color w:val="7030A0"/>
         </w:rPr>
-        <w:t xml:space="preserve">U08  </w:t>
-      </w:r>
-      <w:r>
-        <w:t>¿La jefatura autoriza los sobrepasos?</w:t>
+        <w:t xml:space="preserve">U24  </w:t>
+      </w:r>
+      <w:r>
+        <w:t>Curso especial para egresados</w:t>
       </w:r>
     </w:p>
     <w:p>
@@ -5227,106 +5088,22 @@
           <w:b w:val="0"/>
           <w:i w:val="0"/>
         </w:rPr>
-        <w:t xml:space="preserve">El jefe da el visto bueno de la carga lectiva (C47). ¿También autoriza los </w:t>
-      </w:r>
-      <w:r>
-        <w:rPr>
-          <w:b/>
-          <w:i w:val="0"/>
-        </w:rPr>
-        <w:t>sobrepasos</w:t>
+        <w:t>(A) con un solo NRC, ¿cómo queda la misma nota en BASIC I, II…? ¿Se matricula al egresado en ese NRC y la nota se pasa en SFASLST</w:t>
+      </w:r>
+      <w:r>
+        <w:rPr>
+          <w:b w:val="0"/>
+          <w:i/>
+          <w:color w:val="6B6478"/>
+        </w:rPr>
+        <w:t xml:space="preserve"> (notas por backoffice)</w:t>
       </w:r>
       <w:r>
         <w:rPr>
           <w:b w:val="0"/>
           <w:i w:val="0"/>
         </w:rPr>
-        <w:t xml:space="preserve"> (SFAROVR)?</w:t>
-      </w:r>
-    </w:p>
-    <w:tbl>
-      <w:tblPr>
-        <w:tblW w:type="auto" w:w="0"/>
-        <w:jc w:val="center"/>
-        <w:tblBorders>
-          <w:top w:val="single" w:sz="6" w:space="0" w:color="B9A3D9"/>
-          <w:left w:val="single" w:sz="6" w:space="0" w:color="B9A3D9"/>
-          <w:bottom w:val="single" w:sz="6" w:space="0" w:color="B9A3D9"/>
-          <w:right w:val="single" w:sz="6" w:space="0" w:color="B9A3D9"/>
-          <w:insideH w:val="single" w:sz="6" w:space="0" w:color="B9A3D9"/>
-          <w:insideV w:val="single" w:sz="6" w:space="0" w:color="B9A3D9"/>
-        </w:tblBorders>
-        <w:tblCellMar>
-          <w:top w:w="60" w:type="dxa"/>
-          <w:left w:w="110" w:type="dxa"/>
-          <w:bottom w:w="60" w:type="dxa"/>
-          <w:right w:w="110" w:type="dxa"/>
-        </w:tblCellMar>
-        <w:tblLook w:firstColumn="1" w:firstRow="1" w:lastColumn="0" w:lastRow="0" w:noHBand="0" w:noVBand="1" w:val="04A0"/>
-      </w:tblPr>
-      <w:tblGrid>
-        <w:gridCol w:w="9638"/>
-      </w:tblGrid>
-      <w:tr>
-        <w:trPr>
-          <w:cantSplit/>
-        </w:trPr>
-        <w:tc>
-          <w:tcPr>
-            <w:tcW w:type="dxa" w:w="9638"/>
-          </w:tcPr>
-          <w:p>
-            <w:r>
-              <w:rPr>
-                <w:b/>
-                <w:color w:val="7030A0"/>
-                <w:sz w:val="16"/>
-              </w:rPr>
-              <w:t>RESPUESTA</w:t>
-            </w:r>
-          </w:p>
-          <w:p/>
-          <w:p/>
-          <w:p/>
-        </w:tc>
-      </w:tr>
-    </w:tbl>
-    <w:p>
-      <w:pPr>
-        <w:spacing w:before="60" w:after="160"/>
-      </w:pPr>
-      <w:r>
-        <w:rPr>
-          <w:color w:val="6B6478"/>
-          <w:sz w:val="17"/>
-        </w:rPr>
-        <w:t>Respondió: ____________________________     Estado:   ☐ Resuelta    ☐ Sigue abierta    ☐ Lo revisa Ellucian</w:t>
-      </w:r>
-    </w:p>
-    <w:p>
-      <w:pPr>
-        <w:pStyle w:val="Heading3"/>
-      </w:pPr>
-      <w:r>
-        <w:rPr>
-          <w:color w:val="7030A0"/>
-        </w:rPr>
-        <w:t xml:space="preserve">U24  </w:t>
-      </w:r>
-      <w:r>
-        <w:t>Curso especial para egresados</w:t>
-      </w:r>
-    </w:p>
-    <w:p>
-      <w:pPr>
-        <w:keepNext/>
-      </w:pPr>
-      <w:r>
-        <w:rPr>
-          <w:b w:val="0"/>
-          <w:i w:val="0"/>
-        </w:rPr>
-        <w:t>(A) con un solo NRC, ¿cómo queda la misma nota en BASIC I, II…? ¿Se matricula al egresado en ese NRC y la nota se pasa en SFASLST, se carga en la historia (SHATCKN</w:t>
+        <w:t>, se carga en la historia (SHATCKN</w:t>
       </w:r>
       <w:r>
         <w:rPr>
@@ -9069,42 +8846,6 @@
                 <w:color w:val="5C2193"/>
                 <w:sz w:val="18"/>
               </w:rPr>
-              <w:t>ATTRGRD</w:t>
-            </w:r>
-          </w:p>
-        </w:tc>
-        <w:tc>
-          <w:tcPr>
-            <w:tcW w:type="dxa" w:w="7824"/>
-          </w:tcPr>
-          <w:p>
-            <w:pPr>
-              <w:spacing w:after="0"/>
-            </w:pPr>
-            <w:r>
-              <w:rPr>
-                <w:sz w:val="18"/>
-              </w:rPr>
-              <w:t>Componente de asistencia</w:t>
-            </w:r>
-          </w:p>
-        </w:tc>
-      </w:tr>
-      <w:tr>
-        <w:tc>
-          <w:tcPr>
-            <w:tcW w:type="dxa" w:w="1814"/>
-          </w:tcPr>
-          <w:p>
-            <w:pPr>
-              <w:spacing w:after="0"/>
-            </w:pPr>
-            <w:r>
-              <w:rPr>
-                <w:b/>
-                <w:color w:val="5C2193"/>
-                <w:sz w:val="18"/>
-              </w:rPr>
               <w:t>CAPP</w:t>
             </w:r>
           </w:p>
@@ -9158,78 +8899,6 @@
                 <w:sz w:val="18"/>
               </w:rPr>
               <w:t>Equivalente a tiempo completo</w:t>
-            </w:r>
-          </w:p>
-        </w:tc>
-      </w:tr>
-      <w:tr>
-        <w:tc>
-          <w:tcPr>
-            <w:tcW w:type="dxa" w:w="1814"/>
-          </w:tcPr>
-          <w:p>
-            <w:pPr>
-              <w:spacing w:after="0"/>
-            </w:pPr>
-            <w:r>
-              <w:rPr>
-                <w:b/>
-                <w:color w:val="5C2193"/>
-                <w:sz w:val="18"/>
-              </w:rPr>
-              <w:t>GORICCR</w:t>
-            </w:r>
-          </w:p>
-        </w:tc>
-        <w:tc>
-          <w:tcPr>
-            <w:tcW w:type="dxa" w:w="7824"/>
-          </w:tcPr>
-          <w:p>
-            <w:pPr>
-              <w:spacing w:after="0"/>
-            </w:pPr>
-            <w:r>
-              <w:rPr>
-                <w:sz w:val="18"/>
-              </w:rPr>
-              <w:t>Valores de configuración de las integraciones</w:t>
-            </w:r>
-          </w:p>
-        </w:tc>
-      </w:tr>
-      <w:tr>
-        <w:tc>
-          <w:tcPr>
-            <w:tcW w:type="dxa" w:w="1814"/>
-          </w:tcPr>
-          <w:p>
-            <w:pPr>
-              <w:spacing w:after="0"/>
-            </w:pPr>
-            <w:r>
-              <w:rPr>
-                <w:b/>
-                <w:color w:val="5C2193"/>
-                <w:sz w:val="18"/>
-              </w:rPr>
-              <w:t>GORRSQL</w:t>
-            </w:r>
-          </w:p>
-        </w:tc>
-        <w:tc>
-          <w:tcPr>
-            <w:tcW w:type="dxa" w:w="7824"/>
-          </w:tcPr>
-          <w:p>
-            <w:pPr>
-              <w:spacing w:after="0"/>
-            </w:pPr>
-            <w:r>
-              <w:rPr>
-                <w:sz w:val="18"/>
-              </w:rPr>
-              <w:t>Reglas SQL de los procesos</w:t>
             </w:r>
           </w:p>
         </w:tc>
@@ -10094,42 +9763,6 @@
                 <w:sz w:val="18"/>
               </w:rPr>
               <w:t>CAPP de un estudiante</w:t>
-            </w:r>
-          </w:p>
-        </w:tc>
-      </w:tr>
-      <w:tr>
-        <w:tc>
-          <w:tcPr>
-            <w:tcW w:type="dxa" w:w="1814"/>
-          </w:tcPr>
-          <w:p>
-            <w:pPr>
-              <w:spacing w:after="0"/>
-            </w:pPr>
-            <w:r>
-              <w:rPr>
-                <w:b/>
-                <w:color w:val="5C2193"/>
-                <w:sz w:val="18"/>
-              </w:rPr>
-              <w:t>SOAATRK</w:t>
-            </w:r>
-          </w:p>
-        </w:tc>
-        <w:tc>
-          <w:tcPr>
-            <w:tcW w:type="dxa" w:w="7824"/>
-          </w:tcPr>
-          <w:p>
-            <w:pPr>
-              <w:spacing w:after="0"/>
-            </w:pPr>
-            <w:r>
-              <w:rPr>
-                <w:sz w:val="18"/>
-              </w:rPr>
-              <w:t>Regla de control de asistencia del NRC</w:t>
             </w:r>
           </w:p>
         </w:tc>

</xml_diff>

<commit_message>
Acreditación en Computación: rutas de aprendizaje, costos y certificados (C125, U35 a U39)
Co-Authored-By: Claude Opus 5.5 <noreply@anthropic.com>
Claude-Session: https://claude.ai/code/session_01Et949gzMXkqp3pKk4UbR4f
</commit_message>
<xml_diff>
--- a/docs/dudas/PREGUNTAS PARA ELLUCIAN - REUNIÓN 27-10 - CENTROS EMPRESARIALES.docx
+++ b/docs/dudas/PREGUNTAS PARA ELLUCIAN - REUNIÓN 27-10 - CENTROS EMPRESARIALES.docx
@@ -348,7 +348,7 @@
         <w:rPr>
           <w:color w:val="6B6478"/>
         </w:rPr>
-        <w:t xml:space="preserve">  ·  19 preguntas</w:t>
+        <w:t xml:space="preserve">  ·  23 preguntas</w:t>
       </w:r>
     </w:p>
     <w:p>
@@ -386,7 +386,7 @@
           <w:color w:val="6B6478"/>
           <w:sz w:val="19"/>
         </w:rPr>
-        <w:t>U31, U19, U05, U12, U13</w:t>
+        <w:t>U19, U05, U12, U13</w:t>
       </w:r>
     </w:p>
     <w:p>
@@ -444,6 +444,25 @@
           <w:sz w:val="19"/>
         </w:rPr>
         <w:t>U14, U15, U07</w:t>
+      </w:r>
+    </w:p>
+    <w:p>
+      <w:pPr>
+        <w:spacing w:after="0"/>
+        <w:ind w:left="340"/>
+      </w:pPr>
+      <w:r>
+        <w:rPr>
+          <w:sz w:val="19"/>
+        </w:rPr>
+        <w:t xml:space="preserve">Acreditación en Computación (rutas de aprendizaje): </w:t>
+      </w:r>
+      <w:r>
+        <w:rPr>
+          <w:color w:val="6B6478"/>
+          <w:sz w:val="19"/>
+        </w:rPr>
+        <w:t>U35, U37, U38, U36, U39</w:t>
       </w:r>
     </w:p>
     <w:p>
@@ -4280,23 +4299,16 @@
         <w:rPr>
           <w:color w:val="7030A0"/>
         </w:rPr>
-        <w:t xml:space="preserve">U31  </w:t>
-      </w:r>
-      <w:r>
-        <w:t>¿CMEMC44 o CMEMC38 para Diseño Web?</w:t>
+        <w:t xml:space="preserve">U19  </w:t>
+      </w:r>
+      <w:r>
+        <w:t>Programa MC38 y regla ECOM-01</w:t>
       </w:r>
     </w:p>
     <w:p>
       <w:pPr>
         <w:keepNext/>
       </w:pPr>
-      <w:r>
-        <w:rPr>
-          <w:b w:val="0"/>
-          <w:i w:val="0"/>
-        </w:rPr>
-        <w:t xml:space="preserve">La hoja de NRC 202656 y los alumnos de prueba usan </w:t>
-      </w:r>
       <w:r>
         <w:rPr>
           <w:rFonts w:ascii="Consolas" w:hAnsi="Consolas"/>
@@ -4311,7 +4323,7 @@
           <w:b w:val="0"/>
           <w:i w:val="0"/>
         </w:rPr>
-        <w:t xml:space="preserve"> «Acreditación Computación XP 01» (malla MC38-01, regla ECOM-01), pero al alumno </w:t>
+        <w:t xml:space="preserve"> y el nivel </w:t>
       </w:r>
       <w:r>
         <w:rPr>
@@ -4320,46 +4332,42 @@
           <w:i w:val="0"/>
           <w:sz w:val="19"/>
         </w:rPr>
-        <w:t>100582059</w:t>
+        <w:t>C</w:t>
       </w:r>
       <w:r>
         <w:rPr>
           <w:b w:val="0"/>
           <w:i w:val="0"/>
         </w:rPr>
-        <w:t xml:space="preserve"> se le dio </w:t>
-      </w:r>
-      <w:r>
-        <w:rPr>
-          <w:rFonts w:ascii="Consolas" w:hAnsi="Consolas"/>
+        <w:t xml:space="preserve"> ya están confirmados. ¿Qué programa es </w:t>
+      </w:r>
+      <w:r>
+        <w:rPr>
+          <w:b/>
+          <w:i w:val="0"/>
+        </w:rPr>
+        <w:t>MC38</w:t>
+      </w:r>
+      <w:r>
+        <w:rPr>
           <w:b w:val="0"/>
           <w:i w:val="0"/>
-          <w:sz w:val="19"/>
-        </w:rPr>
-        <w:t>CMEMC44</w:t>
+        </w:rPr>
+        <w:t xml:space="preserve"> en SMAAREA y la regla </w:t>
+      </w:r>
+      <w:r>
+        <w:rPr>
+          <w:b/>
+          <w:i w:val="0"/>
+        </w:rPr>
+        <w:t>ECOM-01</w:t>
       </w:r>
       <w:r>
         <w:rPr>
           <w:b w:val="0"/>
           <w:i w:val="0"/>
         </w:rPr>
-        <w:t xml:space="preserve"> «Acreditación Computación XP 07» (C100). ¿Qué distingue a XP 01 de XP 07 y cuál corresponde a Diseño Web (</w:t>
-      </w:r>
-      <w:r>
-        <w:rPr>
-          <w:rFonts w:ascii="Consolas" w:hAnsi="Consolas"/>
-          <w:b w:val="0"/>
-          <w:i w:val="0"/>
-          <w:sz w:val="19"/>
-        </w:rPr>
-        <w:t>ESEC 00684</w:t>
-      </w:r>
-      <w:r>
-        <w:rPr>
-          <w:b w:val="0"/>
-          <w:i w:val="0"/>
-        </w:rPr>
-        <w:t>)? No bloquea la matrícula, pero sí el CAPP.</w:t>
+        <w:t xml:space="preserve"> es el requisito de computación de pregrado?</w:t>
       </w:r>
     </w:p>
     <w:tbl>
@@ -4429,16 +4437,37 @@
         <w:rPr>
           <w:color w:val="7030A0"/>
         </w:rPr>
-        <w:t xml:space="preserve">U19  </w:t>
-      </w:r>
-      <w:r>
-        <w:t>Programa MC38 y regla ECOM-01</w:t>
+        <w:t xml:space="preserve">U05  </w:t>
+      </w:r>
+      <w:r>
+        <w:t>Nombres de los cursos de Emprendimiento en el catálogo</w:t>
       </w:r>
     </w:p>
     <w:p>
       <w:pPr>
         <w:keepNext/>
       </w:pPr>
+      <w:r>
+        <w:rPr>
+          <w:b w:val="0"/>
+          <w:i w:val="0"/>
+        </w:rPr>
+        <w:t xml:space="preserve">En Idiomas y Computación los cursos ya están confirmados. ¿Cuáles son los nombres y códigos de los cursos de </w:t>
+      </w:r>
+      <w:r>
+        <w:rPr>
+          <w:b/>
+          <w:i w:val="0"/>
+        </w:rPr>
+        <w:t>Emprendimiento</w:t>
+      </w:r>
+      <w:r>
+        <w:rPr>
+          <w:b w:val="0"/>
+          <w:i w:val="0"/>
+        </w:rPr>
+        <w:t xml:space="preserve"> (</w:t>
+      </w:r>
       <w:r>
         <w:rPr>
           <w:rFonts w:ascii="Consolas" w:hAnsi="Consolas"/>
@@ -4446,58 +4475,14 @@
           <w:i w:val="0"/>
           <w:sz w:val="19"/>
         </w:rPr>
-        <w:t>CMEMC38</w:t>
+        <w:t>ESGE</w:t>
       </w:r>
       <w:r>
         <w:rPr>
           <w:b w:val="0"/>
           <w:i w:val="0"/>
         </w:rPr>
-        <w:t xml:space="preserve"> y el nivel </w:t>
-      </w:r>
-      <w:r>
-        <w:rPr>
-          <w:rFonts w:ascii="Consolas" w:hAnsi="Consolas"/>
-          <w:b w:val="0"/>
-          <w:i w:val="0"/>
-          <w:sz w:val="19"/>
-        </w:rPr>
-        <w:t>C</w:t>
-      </w:r>
-      <w:r>
-        <w:rPr>
-          <w:b w:val="0"/>
-          <w:i w:val="0"/>
-        </w:rPr>
-        <w:t xml:space="preserve"> ya están confirmados. ¿Qué programa es </w:t>
-      </w:r>
-      <w:r>
-        <w:rPr>
-          <w:b/>
-          <w:i w:val="0"/>
-        </w:rPr>
-        <w:t>MC38</w:t>
-      </w:r>
-      <w:r>
-        <w:rPr>
-          <w:b w:val="0"/>
-          <w:i w:val="0"/>
-        </w:rPr>
-        <w:t xml:space="preserve"> en SMAAREA y la regla </w:t>
-      </w:r>
-      <w:r>
-        <w:rPr>
-          <w:b/>
-          <w:i w:val="0"/>
-        </w:rPr>
-        <w:t>ECOM-01</w:t>
-      </w:r>
-      <w:r>
-        <w:rPr>
-          <w:b w:val="0"/>
-          <w:i w:val="0"/>
-        </w:rPr>
-        <w:t xml:space="preserve"> es el requisito de computación de pregrado?</w:t>
+        <w:t>) en el catálogo de Banner?</w:t>
       </w:r>
     </w:p>
     <w:tbl>
@@ -4567,10 +4552,10 @@
         <w:rPr>
           <w:color w:val="7030A0"/>
         </w:rPr>
-        <w:t xml:space="preserve">U05  </w:t>
-      </w:r>
-      <w:r>
-        <w:t>Nombres de los cursos de Emprendimiento en el catálogo</w:t>
+        <w:t xml:space="preserve">U12  </w:t>
+      </w:r>
+      <w:r>
+        <w:t>Planes en rediseño y de posgrado antes de 20271</w:t>
       </w:r>
     </w:p>
     <w:p>
@@ -4582,37 +4567,7 @@
           <w:b w:val="0"/>
           <w:i w:val="0"/>
         </w:rPr>
-        <w:t xml:space="preserve">En Idiomas y Computación los cursos ya están confirmados. ¿Cuáles son los nombres y códigos de los cursos de </w:t>
-      </w:r>
-      <w:r>
-        <w:rPr>
-          <w:b/>
-          <w:i w:val="0"/>
-        </w:rPr>
-        <w:t>Emprendimiento</w:t>
-      </w:r>
-      <w:r>
-        <w:rPr>
-          <w:b w:val="0"/>
-          <w:i w:val="0"/>
-        </w:rPr>
-        <w:t xml:space="preserve"> (</w:t>
-      </w:r>
-      <w:r>
-        <w:rPr>
-          <w:rFonts w:ascii="Consolas" w:hAnsi="Consolas"/>
-          <w:b w:val="0"/>
-          <w:i w:val="0"/>
-          <w:sz w:val="19"/>
-        </w:rPr>
-        <w:t>ESGE</w:t>
-      </w:r>
-      <w:r>
-        <w:rPr>
-          <w:b w:val="0"/>
-          <w:i w:val="0"/>
-        </w:rPr>
-        <w:t>) en el catálogo de Banner?</w:t>
+        <w:t>¿Quién termina los planes en rediseño y el de posgrado (cursos, versión, equivalencias) y con qué fecha límite antes de 20271?</w:t>
       </w:r>
     </w:p>
     <w:tbl>
@@ -4682,10 +4637,10 @@
         <w:rPr>
           <w:color w:val="7030A0"/>
         </w:rPr>
-        <w:t xml:space="preserve">U12  </w:t>
-      </w:r>
-      <w:r>
-        <w:t>Planes en rediseño y de posgrado antes de 20271</w:t>
+        <w:t xml:space="preserve">U13  </w:t>
+      </w:r>
+      <w:r>
+        <w:t>Código del periodo «20271»</w:t>
       </w:r>
     </w:p>
     <w:p>
@@ -4697,7 +4652,7 @@
           <w:b w:val="0"/>
           <w:i w:val="0"/>
         </w:rPr>
-        <w:t>¿Quién termina los planes en rediseño y el de posgrado (cursos, versión, equivalencias) y con qué fecha límite antes de 20271?</w:t>
+        <w:t>«20271»: ¿es el primer periodo de 2027 de posgrado? ¿Cuál es su código de 6 dígitos?</w:t>
       </w:r>
     </w:p>
     <w:tbl>
@@ -4761,20 +4716,28 @@
     </w:p>
     <w:p>
       <w:pPr>
-        <w:pStyle w:val="Heading3"/>
-      </w:pPr>
-      <w:r>
-        <w:rPr>
-          <w:color w:val="7030A0"/>
-        </w:rPr>
-        <w:t xml:space="preserve">U13  </w:t>
-      </w:r>
-      <w:r>
-        <w:t>Código del periodo «20271»</w:t>
+        <w:pStyle w:val="Heading2"/>
+      </w:pPr>
+      <w:r>
+        <w:t>Matrícula, permisos y egresados</w:t>
       </w:r>
     </w:p>
     <w:p>
       <w:pPr>
+        <w:pStyle w:val="Heading3"/>
+      </w:pPr>
+      <w:r>
+        <w:rPr>
+          <w:color w:val="7030A0"/>
+        </w:rPr>
+        <w:t xml:space="preserve">U10  </w:t>
+      </w:r>
+      <w:r>
+        <w:t>Quién da sobrepasos de prerrequisito</w:t>
+      </w:r>
+    </w:p>
+    <w:p>
+      <w:pPr>
         <w:keepNext/>
       </w:pPr>
       <w:r>
@@ -4782,7 +4745,36 @@
           <w:b w:val="0"/>
           <w:i w:val="0"/>
         </w:rPr>
-        <w:t>«20271»: ¿es el primer periodo de 2027 de posgrado? ¿Cuál es su código de 6 dígitos?</w:t>
+        <w:t xml:space="preserve">¿Quién podrá dar </w:t>
+      </w:r>
+      <w:r>
+        <w:rPr>
+          <w:b/>
+          <w:i w:val="0"/>
+        </w:rPr>
+        <w:t>sobrepasos</w:t>
+      </w:r>
+      <w:r>
+        <w:rPr>
+          <w:b w:val="0"/>
+          <w:i w:val="0"/>
+        </w:rPr>
+        <w:t xml:space="preserve"> de prerrequisito (SFAROVR</w:t>
+      </w:r>
+      <w:r>
+        <w:rPr>
+          <w:b w:val="0"/>
+          <w:i/>
+          <w:color w:val="6B6478"/>
+        </w:rPr>
+        <w:t xml:space="preserve"> (permisos de sobrepaso de inscripción)</w:t>
+      </w:r>
+      <w:r>
+        <w:rPr>
+          <w:b w:val="0"/>
+          <w:i w:val="0"/>
+        </w:rPr>
+        <w:t>)? En SEUSS ese camino no existe.</w:t>
       </w:r>
     </w:p>
     <w:tbl>
@@ -4846,28 +4838,20 @@
     </w:p>
     <w:p>
       <w:pPr>
-        <w:pStyle w:val="Heading2"/>
-      </w:pPr>
-      <w:r>
-        <w:t>Matrícula, permisos y egresados</w:t>
+        <w:pStyle w:val="Heading3"/>
+      </w:pPr>
+      <w:r>
+        <w:rPr>
+          <w:color w:val="7030A0"/>
+        </w:rPr>
+        <w:t xml:space="preserve">U08  </w:t>
+      </w:r>
+      <w:r>
+        <w:t>¿La jefatura autoriza los sobrepasos?</w:t>
       </w:r>
     </w:p>
     <w:p>
       <w:pPr>
-        <w:pStyle w:val="Heading3"/>
-      </w:pPr>
-      <w:r>
-        <w:rPr>
-          <w:color w:val="7030A0"/>
-        </w:rPr>
-        <w:t xml:space="preserve">U10  </w:t>
-      </w:r>
-      <w:r>
-        <w:t>Quién da sobrepasos de prerrequisito</w:t>
-      </w:r>
-    </w:p>
-    <w:p>
-      <w:pPr>
         <w:keepNext/>
       </w:pPr>
       <w:r>
@@ -4875,7 +4859,7 @@
           <w:b w:val="0"/>
           <w:i w:val="0"/>
         </w:rPr>
-        <w:t xml:space="preserve">¿Quién podrá dar </w:t>
+        <w:t xml:space="preserve">El jefe da el visto bueno de la carga lectiva (C47). ¿También autoriza los </w:t>
       </w:r>
       <w:r>
         <w:rPr>
@@ -4889,22 +4873,7 @@
           <w:b w:val="0"/>
           <w:i w:val="0"/>
         </w:rPr>
-        <w:t xml:space="preserve"> de prerrequisito (SFAROVR</w:t>
-      </w:r>
-      <w:r>
-        <w:rPr>
-          <w:b w:val="0"/>
-          <w:i/>
-          <w:color w:val="6B6478"/>
-        </w:rPr>
-        <w:t xml:space="preserve"> (permisos de sobrepaso de inscripción)</w:t>
-      </w:r>
-      <w:r>
-        <w:rPr>
-          <w:b w:val="0"/>
-          <w:i w:val="0"/>
-        </w:rPr>
-        <w:t>)? En SEUSS ese camino no existe.</w:t>
+        <w:t xml:space="preserve"> (SFAROVR)?</w:t>
       </w:r>
     </w:p>
     <w:tbl>
@@ -4974,10 +4943,10 @@
         <w:rPr>
           <w:color w:val="7030A0"/>
         </w:rPr>
-        <w:t xml:space="preserve">U08  </w:t>
-      </w:r>
-      <w:r>
-        <w:t>¿La jefatura autoriza los sobrepasos?</w:t>
+        <w:t xml:space="preserve">U24  </w:t>
+      </w:r>
+      <w:r>
+        <w:t>Curso especial para egresados</w:t>
       </w:r>
     </w:p>
     <w:p>
@@ -4989,21 +4958,37 @@
           <w:b w:val="0"/>
           <w:i w:val="0"/>
         </w:rPr>
-        <w:t xml:space="preserve">El jefe da el visto bueno de la carga lectiva (C47). ¿También autoriza los </w:t>
-      </w:r>
-      <w:r>
-        <w:rPr>
-          <w:b/>
-          <w:i w:val="0"/>
-        </w:rPr>
-        <w:t>sobrepasos</w:t>
+        <w:t>(A) con un solo NRC, ¿cómo queda la misma nota en BASIC I, II…? ¿Se matricula al egresado en ese NRC y la nota se pasa en SFASLST</w:t>
+      </w:r>
+      <w:r>
+        <w:rPr>
+          <w:b w:val="0"/>
+          <w:i/>
+          <w:color w:val="6B6478"/>
+        </w:rPr>
+        <w:t xml:space="preserve"> (notas por backoffice)</w:t>
       </w:r>
       <w:r>
         <w:rPr>
           <w:b w:val="0"/>
           <w:i w:val="0"/>
         </w:rPr>
-        <w:t xml:space="preserve"> (SFAROVR)?</w:t>
+        <w:t>, se carga en la historia (SHATCKN</w:t>
+      </w:r>
+      <w:r>
+        <w:rPr>
+          <w:b w:val="0"/>
+          <w:i/>
+          <w:color w:val="6B6478"/>
+        </w:rPr>
+        <w:t xml:space="preserve"> (notas ya en la historia académica)</w:t>
+      </w:r>
+      <w:r>
+        <w:rPr>
+          <w:b w:val="0"/>
+          <w:i w:val="0"/>
+        </w:rPr>
+        <w:t>) o como puntaje en SOATEST? (b) ¿Cómo se llama la plataforma («Alticia»)? (c) ¿Qué servicio o código de cobro tiene el costo distinto? (d) ¿Computación y Emprendimiento trabajan igual con sus egresados?</w:t>
       </w:r>
     </w:p>
     <w:tbl>
@@ -5067,20 +5052,28 @@
     </w:p>
     <w:p>
       <w:pPr>
-        <w:pStyle w:val="Heading3"/>
-      </w:pPr>
-      <w:r>
-        <w:rPr>
-          <w:color w:val="7030A0"/>
-        </w:rPr>
-        <w:t xml:space="preserve">U24  </w:t>
-      </w:r>
-      <w:r>
-        <w:t>Curso especial para egresados</w:t>
+        <w:pStyle w:val="Heading2"/>
+      </w:pPr>
+      <w:r>
+        <w:t>Docentes</w:t>
       </w:r>
     </w:p>
     <w:p>
       <w:pPr>
+        <w:pStyle w:val="Heading3"/>
+      </w:pPr>
+      <w:r>
+        <w:rPr>
+          <w:color w:val="7030A0"/>
+        </w:rPr>
+        <w:t xml:space="preserve">U26  </w:t>
+      </w:r>
+      <w:r>
+        <w:t>Qué hace Registros Académicos en la carga lectiva</w:t>
+      </w:r>
+    </w:p>
+    <w:p>
+      <w:pPr>
         <w:keepNext/>
       </w:pPr>
       <w:r>
@@ -5088,7 +5081,7 @@
           <w:b w:val="0"/>
           <w:i w:val="0"/>
         </w:rPr>
-        <w:t>(A) con un solo NRC, ¿cómo queda la misma nota en BASIC I, II…? ¿Se matricula al egresado en ese NRC y la nota se pasa en SFASLST</w:t>
+        <w:t>En el flujo del usuario (C06) dice «periodos y carga lectiva (RA)», pero el 05/10 confirmó que el jefe asigna a los docentes y el Vicerrectorado Académico aprueba (C47, C48, ADR-011). ¿RA solo abre el periodo y configura SIATERM y SIAINST</w:t>
       </w:r>
       <w:r>
         <w:rPr>
@@ -5096,29 +5089,14 @@
           <w:i/>
           <w:color w:val="6B6478"/>
         </w:rPr>
-        <w:t xml:space="preserve"> (notas por backoffice)</w:t>
+        <w:t xml:space="preserve"> (datos del docente)</w:t>
       </w:r>
       <w:r>
         <w:rPr>
           <w:b w:val="0"/>
           <w:i w:val="0"/>
         </w:rPr>
-        <w:t>, se carga en la historia (SHATCKN</w:t>
-      </w:r>
-      <w:r>
-        <w:rPr>
-          <w:b w:val="0"/>
-          <w:i/>
-          <w:color w:val="6B6478"/>
-        </w:rPr>
-        <w:t xml:space="preserve"> (notas ya en la historia académica)</w:t>
-      </w:r>
-      <w:r>
-        <w:rPr>
-          <w:b w:val="0"/>
-          <w:i w:val="0"/>
-        </w:rPr>
-        <w:t>) o como puntaje en SOATEST? (b) ¿Cómo se llama la plataforma («Alticia»)? (c) ¿Qué servicio o código de cobro tiene el costo distinto? (d) ¿Computación y Emprendimiento trabajan igual con sus egresados?</w:t>
+        <w:t>, o también revisa la carga?</w:t>
       </w:r>
     </w:p>
     <w:tbl>
@@ -5182,28 +5160,20 @@
     </w:p>
     <w:p>
       <w:pPr>
-        <w:pStyle w:val="Heading2"/>
-      </w:pPr>
-      <w:r>
-        <w:t>Docentes</w:t>
+        <w:pStyle w:val="Heading3"/>
+      </w:pPr>
+      <w:r>
+        <w:rPr>
+          <w:color w:val="7030A0"/>
+        </w:rPr>
+        <w:t xml:space="preserve">U28  </w:t>
+      </w:r>
+      <w:r>
+        <w:t>Carga por contrato o por regla de carga</w:t>
       </w:r>
     </w:p>
     <w:p>
       <w:pPr>
-        <w:pStyle w:val="Heading3"/>
-      </w:pPr>
-      <w:r>
-        <w:rPr>
-          <w:color w:val="7030A0"/>
-        </w:rPr>
-        <w:t xml:space="preserve">U26  </w:t>
-      </w:r>
-      <w:r>
-        <w:t>Qué hace Registros Académicos en la carga lectiva</w:t>
-      </w:r>
-    </w:p>
-    <w:p>
-      <w:pPr>
         <w:keepNext/>
       </w:pPr>
       <w:r>
@@ -5211,7 +5181,67 @@
           <w:b w:val="0"/>
           <w:i w:val="0"/>
         </w:rPr>
-        <w:t>En el flujo del usuario (C06) dice «periodos y carga lectiva (RA)», pero el 05/10 confirmó que el jefe asigna a los docentes y el Vicerrectorado Académico aprueba (C47, C48, ADR-011). ¿RA solo abre el periodo y configura SIATERM y SIAINST</w:t>
+        <w:t xml:space="preserve">Los contratos </w:t>
+      </w:r>
+      <w:r>
+        <w:rPr>
+          <w:rFonts w:ascii="Consolas" w:hAnsi="Consolas"/>
+          <w:b w:val="0"/>
+          <w:i w:val="0"/>
+          <w:sz w:val="19"/>
+        </w:rPr>
+        <w:t>ES</w:t>
+      </w:r>
+      <w:r>
+        <w:rPr>
+          <w:b w:val="0"/>
+          <w:i w:val="0"/>
+        </w:rPr>
+        <w:t xml:space="preserve"> y </w:t>
+      </w:r>
+      <w:r>
+        <w:rPr>
+          <w:rFonts w:ascii="Consolas" w:hAnsi="Consolas"/>
+          <w:b w:val="0"/>
+          <w:i w:val="0"/>
+          <w:sz w:val="19"/>
+        </w:rPr>
+        <w:t>FC</w:t>
+      </w:r>
+      <w:r>
+        <w:rPr>
+          <w:b w:val="0"/>
+          <w:i w:val="0"/>
+        </w:rPr>
+        <w:t xml:space="preserve"> ya están creados. (a) ¿La carga se mide </w:t>
+      </w:r>
+      <w:r>
+        <w:rPr>
+          <w:b/>
+          <w:i w:val="0"/>
+        </w:rPr>
+        <w:t>por contrato</w:t>
+      </w:r>
+      <w:r>
+        <w:rPr>
+          <w:b w:val="0"/>
+          <w:i w:val="0"/>
+        </w:rPr>
+        <w:t xml:space="preserve"> (SIAFLCT y SIACONA, lo recomendado en ADR-020) o </w:t>
+      </w:r>
+      <w:r>
+        <w:rPr>
+          <w:b/>
+          <w:i w:val="0"/>
+        </w:rPr>
+        <w:t>por regla de carga</w:t>
+      </w:r>
+      <w:r>
+        <w:rPr>
+          <w:b w:val="0"/>
+          <w:i w:val="0"/>
+        </w:rPr>
+        <w:t xml:space="preserve"> (SIAFLRT y SIAASGN)? (b) ¿Quién crea en STVCNTR</w:t>
       </w:r>
       <w:r>
         <w:rPr>
@@ -5219,14 +5249,29 @@
           <w:i/>
           <w:color w:val="6B6478"/>
         </w:rPr>
-        <w:t xml:space="preserve"> (datos del docente)</w:t>
+        <w:t xml:space="preserve"> (catálogo de reglas de carga del contrato)</w:t>
       </w:r>
       <w:r>
         <w:rPr>
           <w:b w:val="0"/>
           <w:i w:val="0"/>
         </w:rPr>
-        <w:t>, o también revisa la carga?</w:t>
+        <w:t xml:space="preserve"> los códigos de regla de cada contrato y en STVNIST</w:t>
+      </w:r>
+      <w:r>
+        <w:rPr>
+          <w:b w:val="0"/>
+          <w:i/>
+          <w:color w:val="6B6478"/>
+        </w:rPr>
+        <w:t xml:space="preserve"> (catálogo de labores no educativas)</w:t>
+      </w:r>
+      <w:r>
+        <w:rPr>
+          <w:b w:val="0"/>
+          <w:i w:val="0"/>
+        </w:rPr>
+        <w:t xml:space="preserve"> los tipos de labor no educativa (matrícula, coordinación, atención a estudiantes)?</w:t>
       </w:r>
     </w:p>
     <w:tbl>
@@ -5296,10 +5341,10 @@
         <w:rPr>
           <w:color w:val="7030A0"/>
         </w:rPr>
-        <w:t xml:space="preserve">U28  </w:t>
-      </w:r>
-      <w:r>
-        <w:t>Carga por contrato o por regla de carga</w:t>
+        <w:t xml:space="preserve">U16  </w:t>
+      </w:r>
+      <w:r>
+        <w:t>Separación de un docente</w:t>
       </w:r>
     </w:p>
     <w:p>
@@ -5311,97 +5356,7 @@
           <w:b w:val="0"/>
           <w:i w:val="0"/>
         </w:rPr>
-        <w:t xml:space="preserve">Los contratos </w:t>
-      </w:r>
-      <w:r>
-        <w:rPr>
-          <w:rFonts w:ascii="Consolas" w:hAnsi="Consolas"/>
-          <w:b w:val="0"/>
-          <w:i w:val="0"/>
-          <w:sz w:val="19"/>
-        </w:rPr>
-        <w:t>ES</w:t>
-      </w:r>
-      <w:r>
-        <w:rPr>
-          <w:b w:val="0"/>
-          <w:i w:val="0"/>
-        </w:rPr>
-        <w:t xml:space="preserve"> y </w:t>
-      </w:r>
-      <w:r>
-        <w:rPr>
-          <w:rFonts w:ascii="Consolas" w:hAnsi="Consolas"/>
-          <w:b w:val="0"/>
-          <w:i w:val="0"/>
-          <w:sz w:val="19"/>
-        </w:rPr>
-        <w:t>FC</w:t>
-      </w:r>
-      <w:r>
-        <w:rPr>
-          <w:b w:val="0"/>
-          <w:i w:val="0"/>
-        </w:rPr>
-        <w:t xml:space="preserve"> ya están creados. (a) ¿La carga se mide </w:t>
-      </w:r>
-      <w:r>
-        <w:rPr>
-          <w:b/>
-          <w:i w:val="0"/>
-        </w:rPr>
-        <w:t>por contrato</w:t>
-      </w:r>
-      <w:r>
-        <w:rPr>
-          <w:b w:val="0"/>
-          <w:i w:val="0"/>
-        </w:rPr>
-        <w:t xml:space="preserve"> (SIAFLCT y SIACONA, lo recomendado en ADR-020) o </w:t>
-      </w:r>
-      <w:r>
-        <w:rPr>
-          <w:b/>
-          <w:i w:val="0"/>
-        </w:rPr>
-        <w:t>por regla de carga</w:t>
-      </w:r>
-      <w:r>
-        <w:rPr>
-          <w:b w:val="0"/>
-          <w:i w:val="0"/>
-        </w:rPr>
-        <w:t xml:space="preserve"> (SIAFLRT y SIAASGN)? (b) ¿Quién crea en STVCNTR</w:t>
-      </w:r>
-      <w:r>
-        <w:rPr>
-          <w:b w:val="0"/>
-          <w:i/>
-          <w:color w:val="6B6478"/>
-        </w:rPr>
-        <w:t xml:space="preserve"> (catálogo de reglas de carga del contrato)</w:t>
-      </w:r>
-      <w:r>
-        <w:rPr>
-          <w:b w:val="0"/>
-          <w:i w:val="0"/>
-        </w:rPr>
-        <w:t xml:space="preserve"> los códigos de regla de cada contrato y en STVNIST</w:t>
-      </w:r>
-      <w:r>
-        <w:rPr>
-          <w:b w:val="0"/>
-          <w:i/>
-          <w:color w:val="6B6478"/>
-        </w:rPr>
-        <w:t xml:space="preserve"> (catálogo de labores no educativas)</w:t>
-      </w:r>
-      <w:r>
-        <w:rPr>
-          <w:b w:val="0"/>
-          <w:i w:val="0"/>
-        </w:rPr>
-        <w:t xml:space="preserve"> los tipos de labor no educativa (matrícula, coordinación, atención a estudiantes)?</w:t>
+        <w:t>¿Quién decide separar a un docente y cómo se avisa a Registros Académicos?</w:t>
       </w:r>
     </w:p>
     <w:tbl>
@@ -5465,20 +5420,28 @@
     </w:p>
     <w:p>
       <w:pPr>
-        <w:pStyle w:val="Heading3"/>
-      </w:pPr>
-      <w:r>
-        <w:rPr>
-          <w:color w:val="7030A0"/>
-        </w:rPr>
-        <w:t xml:space="preserve">U16  </w:t>
-      </w:r>
-      <w:r>
-        <w:t>Separación de un docente</w:t>
+        <w:pStyle w:val="Heading2"/>
+      </w:pPr>
+      <w:r>
+        <w:t>Servicios y seguimiento</w:t>
       </w:r>
     </w:p>
     <w:p>
       <w:pPr>
+        <w:pStyle w:val="Heading3"/>
+      </w:pPr>
+      <w:r>
+        <w:rPr>
+          <w:color w:val="7030A0"/>
+        </w:rPr>
+        <w:t xml:space="preserve">U14  </w:t>
+      </w:r>
+      <w:r>
+        <w:t>Área que recibe las quejas contra docentes</w:t>
+      </w:r>
+    </w:p>
+    <w:p>
+      <w:pPr>
         <w:keepNext/>
       </w:pPr>
       <w:r>
@@ -5486,7 +5449,7 @@
           <w:b w:val="0"/>
           <w:i w:val="0"/>
         </w:rPr>
-        <w:t>¿Quién decide separar a un docente y cómo se avisa a Registros Académicos?</w:t>
+        <w:t>¿Qué área recibe las quejas contra docentes y cómo se protege al estudiante? ¿Se crea en Banner un servicio de «queja o denuncia» o se atiende fuera?</w:t>
       </w:r>
     </w:p>
     <w:tbl>
@@ -5550,28 +5513,20 @@
     </w:p>
     <w:p>
       <w:pPr>
-        <w:pStyle w:val="Heading2"/>
-      </w:pPr>
-      <w:r>
-        <w:t>Servicios y seguimiento</w:t>
+        <w:pStyle w:val="Heading3"/>
+      </w:pPr>
+      <w:r>
+        <w:rPr>
+          <w:color w:val="7030A0"/>
+        </w:rPr>
+        <w:t xml:space="preserve">U15  </w:t>
+      </w:r>
+      <w:r>
+        <w:t>Tipos de comentario de seguimiento</w:t>
       </w:r>
     </w:p>
     <w:p>
       <w:pPr>
-        <w:pStyle w:val="Heading3"/>
-      </w:pPr>
-      <w:r>
-        <w:rPr>
-          <w:color w:val="7030A0"/>
-        </w:rPr>
-        <w:t xml:space="preserve">U14  </w:t>
-      </w:r>
-      <w:r>
-        <w:t>Área que recibe las quejas contra docentes</w:t>
-      </w:r>
-    </w:p>
-    <w:p>
-      <w:pPr>
         <w:keepNext/>
       </w:pPr>
       <w:r>
@@ -5579,7 +5534,7 @@
           <w:b w:val="0"/>
           <w:i w:val="0"/>
         </w:rPr>
-        <w:t>¿Qué área recibe las quejas contra docentes y cómo se protege al estudiante? ¿Se crea en Banner un servicio de «queja o denuncia» o se atiende fuera?</w:t>
+        <w:t>¿Qué tipos de comentario de seguimiento (SPACMNT) usarán los tutores?</w:t>
       </w:r>
     </w:p>
     <w:tbl>
@@ -5649,10 +5604,10 @@
         <w:rPr>
           <w:color w:val="7030A0"/>
         </w:rPr>
-        <w:t xml:space="preserve">U15  </w:t>
-      </w:r>
-      <w:r>
-        <w:t>Tipos de comentario de seguimiento</w:t>
+        <w:t xml:space="preserve">U07  </w:t>
+      </w:r>
+      <w:r>
+        <w:t>¿La tutoría aplica a los centros?</w:t>
       </w:r>
     </w:p>
     <w:p>
@@ -5664,7 +5619,21 @@
           <w:b w:val="0"/>
           <w:i w:val="0"/>
         </w:rPr>
-        <w:t>¿Qué tipos de comentario de seguimiento (SPACMNT) usarán los tutores?</w:t>
+        <w:t xml:space="preserve">¿La </w:t>
+      </w:r>
+      <w:r>
+        <w:rPr>
+          <w:b/>
+          <w:i w:val="0"/>
+        </w:rPr>
+        <w:t>tutoría</w:t>
+      </w:r>
+      <w:r>
+        <w:rPr>
+          <w:b w:val="0"/>
+          <w:i w:val="0"/>
+        </w:rPr>
+        <w:t xml:space="preserve"> aplica a los centros?</w:t>
       </w:r>
     </w:p>
     <w:tbl>
@@ -5728,20 +5697,28 @@
     </w:p>
     <w:p>
       <w:pPr>
-        <w:pStyle w:val="Heading3"/>
-      </w:pPr>
-      <w:r>
-        <w:rPr>
-          <w:color w:val="7030A0"/>
-        </w:rPr>
-        <w:t xml:space="preserve">U07  </w:t>
-      </w:r>
-      <w:r>
-        <w:t>¿La tutoría aplica a los centros?</w:t>
+        <w:pStyle w:val="Heading2"/>
+      </w:pPr>
+      <w:r>
+        <w:t>Acreditación en Computación (rutas de aprendizaje)</w:t>
       </w:r>
     </w:p>
     <w:p>
       <w:pPr>
+        <w:pStyle w:val="Heading3"/>
+      </w:pPr>
+      <w:r>
+        <w:rPr>
+          <w:color w:val="7030A0"/>
+        </w:rPr>
+        <w:t xml:space="preserve">U35  </w:t>
+      </w:r>
+      <w:r>
+        <w:t>¿4 talleres o un 4.º curso?</w:t>
+      </w:r>
+    </w:p>
+    <w:p>
+      <w:pPr>
         <w:keepNext/>
       </w:pPr>
       <w:r>
@@ -5749,21 +5726,508 @@
           <w:b w:val="0"/>
           <w:i w:val="0"/>
         </w:rPr>
-        <w:t xml:space="preserve">¿La </w:t>
+        <w:t xml:space="preserve">La lámina 4 (2026) dice «3 cursos de la ruta + 1 taller </w:t>
       </w:r>
       <w:r>
         <w:rPr>
           <w:b/>
           <w:i w:val="0"/>
         </w:rPr>
-        <w:t>tutoría</w:t>
+        <w:t>o 4 talleres de certificación internacional</w:t>
       </w:r>
       <w:r>
         <w:rPr>
           <w:b w:val="0"/>
           <w:i w:val="0"/>
         </w:rPr>
-        <w:t xml:space="preserve"> aplica a los centros?</w:t>
+        <w:t xml:space="preserve">»; el PDF 2025 y C62/C67 dicen «3 cursos + taller </w:t>
+      </w:r>
+      <w:r>
+        <w:rPr>
+          <w:b/>
+          <w:i w:val="0"/>
+        </w:rPr>
+        <w:t>o un 4.º curso</w:t>
+      </w:r>
+      <w:r>
+        <w:rPr>
+          <w:b w:val="0"/>
+          <w:i w:val="0"/>
+        </w:rPr>
+        <w:t>». ¿Cuál rige y cómo se arma en CAPP?</w:t>
+      </w:r>
+    </w:p>
+    <w:p>
+      <w:pPr>
+        <w:keepNext/>
+        <w:ind w:left="170"/>
+      </w:pPr>
+      <w:r>
+        <w:rPr>
+          <w:b/>
+          <w:color w:val="4EA72E"/>
+          <w:sz w:val="19"/>
+        </w:rPr>
+        <w:t xml:space="preserve">Lo que ya sabemos: </w:t>
+      </w:r>
+      <w:r>
+        <w:rPr>
+          <w:b w:val="0"/>
+          <w:i w:val="0"/>
+          <w:color w:val="4A4458"/>
+          <w:sz w:val="19"/>
+        </w:rPr>
+        <w:t>Lámina 4 (2026): 3 cursos de la ruta + 1 taller, o 4 talleres. PDF 2025, C62 y C67: 3 cursos + taller, o un 4.º curso (C125).</w:t>
+      </w:r>
+    </w:p>
+    <w:tbl>
+      <w:tblPr>
+        <w:tblW w:type="auto" w:w="0"/>
+        <w:jc w:val="center"/>
+        <w:tblBorders>
+          <w:top w:val="single" w:sz="6" w:space="0" w:color="B9A3D9"/>
+          <w:left w:val="single" w:sz="6" w:space="0" w:color="B9A3D9"/>
+          <w:bottom w:val="single" w:sz="6" w:space="0" w:color="B9A3D9"/>
+          <w:right w:val="single" w:sz="6" w:space="0" w:color="B9A3D9"/>
+          <w:insideH w:val="single" w:sz="6" w:space="0" w:color="B9A3D9"/>
+          <w:insideV w:val="single" w:sz="6" w:space="0" w:color="B9A3D9"/>
+        </w:tblBorders>
+        <w:tblCellMar>
+          <w:top w:w="60" w:type="dxa"/>
+          <w:left w:w="110" w:type="dxa"/>
+          <w:bottom w:w="60" w:type="dxa"/>
+          <w:right w:w="110" w:type="dxa"/>
+        </w:tblCellMar>
+        <w:tblLook w:firstColumn="1" w:firstRow="1" w:lastColumn="0" w:lastRow="0" w:noHBand="0" w:noVBand="1" w:val="04A0"/>
+      </w:tblPr>
+      <w:tblGrid>
+        <w:gridCol w:w="9638"/>
+      </w:tblGrid>
+      <w:tr>
+        <w:trPr>
+          <w:cantSplit/>
+        </w:trPr>
+        <w:tc>
+          <w:tcPr>
+            <w:tcW w:type="dxa" w:w="9638"/>
+          </w:tcPr>
+          <w:p>
+            <w:r>
+              <w:rPr>
+                <w:b/>
+                <w:color w:val="7030A0"/>
+                <w:sz w:val="16"/>
+              </w:rPr>
+              <w:t>RESPUESTA</w:t>
+            </w:r>
+          </w:p>
+          <w:p/>
+          <w:p/>
+          <w:p/>
+        </w:tc>
+      </w:tr>
+    </w:tbl>
+    <w:p>
+      <w:pPr>
+        <w:spacing w:before="60" w:after="160"/>
+      </w:pPr>
+      <w:r>
+        <w:rPr>
+          <w:color w:val="6B6478"/>
+          <w:sz w:val="17"/>
+        </w:rPr>
+        <w:t>Respondió: ____________________________     Estado:   ☐ Resuelta    ☐ Sigue abierta    ☐ Lo revisa Ellucian</w:t>
+      </w:r>
+    </w:p>
+    <w:p>
+      <w:pPr>
+        <w:pStyle w:val="Heading3"/>
+      </w:pPr>
+      <w:r>
+        <w:rPr>
+          <w:color w:val="7030A0"/>
+        </w:rPr>
+        <w:t xml:space="preserve">U37  </w:t>
+      </w:r>
+      <w:r>
+        <w:t>Código de Banner de cada ruta</w:t>
+      </w:r>
+    </w:p>
+    <w:p>
+      <w:pPr>
+        <w:keepNext/>
+      </w:pPr>
+      <w:r>
+        <w:rPr>
+          <w:rFonts w:ascii="Consolas" w:hAnsi="Consolas"/>
+          <w:b w:val="0"/>
+          <w:i w:val="0"/>
+          <w:sz w:val="19"/>
+        </w:rPr>
+        <w:t>CMEMC38</w:t>
+      </w:r>
+      <w:r>
+        <w:rPr>
+          <w:b w:val="0"/>
+          <w:i w:val="0"/>
+        </w:rPr>
+        <w:t xml:space="preserve"> = XP 01 y </w:t>
+      </w:r>
+      <w:r>
+        <w:rPr>
+          <w:rFonts w:ascii="Consolas" w:hAnsi="Consolas"/>
+          <w:b w:val="0"/>
+          <w:i w:val="0"/>
+          <w:sz w:val="19"/>
+        </w:rPr>
+        <w:t>CMEMC44</w:t>
+      </w:r>
+      <w:r>
+        <w:rPr>
+          <w:b w:val="0"/>
+          <w:i w:val="0"/>
+        </w:rPr>
+        <w:t xml:space="preserve"> = XP 07. ¿</w:t>
+      </w:r>
+      <w:r>
+        <w:rPr>
+          <w:rFonts w:ascii="Consolas" w:hAnsi="Consolas"/>
+          <w:b w:val="0"/>
+          <w:i w:val="0"/>
+          <w:sz w:val="19"/>
+        </w:rPr>
+        <w:t>CMEMC39</w:t>
+      </w:r>
+      <w:r>
+        <w:rPr>
+          <w:b w:val="0"/>
+          <w:i w:val="0"/>
+        </w:rPr>
+        <w:t xml:space="preserve"> a </w:t>
+      </w:r>
+      <w:r>
+        <w:rPr>
+          <w:rFonts w:ascii="Consolas" w:hAnsi="Consolas"/>
+          <w:b w:val="0"/>
+          <w:i w:val="0"/>
+          <w:sz w:val="19"/>
+        </w:rPr>
+        <w:t>CMEMC43</w:t>
+      </w:r>
+      <w:r>
+        <w:rPr>
+          <w:b w:val="0"/>
+          <w:i w:val="0"/>
+        </w:rPr>
+        <w:t xml:space="preserve"> son las rutas 2 a 6? Ingeniería Civil y Arquitectura están en las rutas 4 y 6, y Sistemas y Software en las 5 y 7: ¿cómo se elige la ruta del alumno?</w:t>
+      </w:r>
+    </w:p>
+    <w:p>
+      <w:pPr>
+        <w:keepNext/>
+        <w:ind w:left="170"/>
+      </w:pPr>
+      <w:r>
+        <w:rPr>
+          <w:b/>
+          <w:color w:val="4EA72E"/>
+          <w:sz w:val="19"/>
+        </w:rPr>
+        <w:t xml:space="preserve">Lo que ya sabemos: </w:t>
+      </w:r>
+      <w:r>
+        <w:rPr>
+          <w:b w:val="0"/>
+          <w:i w:val="0"/>
+          <w:color w:val="4A4458"/>
+          <w:sz w:val="19"/>
+        </w:rPr>
+        <w:t>Cada programa XP es una ruta (C125). CMEMC38 = XP 01 y CMEMC44 = XP 07; Diseño Web está en las rutas 5 y 7, por eso el NRC 10044 va con CMEMC44.</w:t>
+      </w:r>
+    </w:p>
+    <w:tbl>
+      <w:tblPr>
+        <w:tblW w:type="auto" w:w="0"/>
+        <w:jc w:val="center"/>
+        <w:tblBorders>
+          <w:top w:val="single" w:sz="6" w:space="0" w:color="B9A3D9"/>
+          <w:left w:val="single" w:sz="6" w:space="0" w:color="B9A3D9"/>
+          <w:bottom w:val="single" w:sz="6" w:space="0" w:color="B9A3D9"/>
+          <w:right w:val="single" w:sz="6" w:space="0" w:color="B9A3D9"/>
+          <w:insideH w:val="single" w:sz="6" w:space="0" w:color="B9A3D9"/>
+          <w:insideV w:val="single" w:sz="6" w:space="0" w:color="B9A3D9"/>
+        </w:tblBorders>
+        <w:tblCellMar>
+          <w:top w:w="60" w:type="dxa"/>
+          <w:left w:w="110" w:type="dxa"/>
+          <w:bottom w:w="60" w:type="dxa"/>
+          <w:right w:w="110" w:type="dxa"/>
+        </w:tblCellMar>
+        <w:tblLook w:firstColumn="1" w:firstRow="1" w:lastColumn="0" w:lastRow="0" w:noHBand="0" w:noVBand="1" w:val="04A0"/>
+      </w:tblPr>
+      <w:tblGrid>
+        <w:gridCol w:w="9638"/>
+      </w:tblGrid>
+      <w:tr>
+        <w:trPr>
+          <w:cantSplit/>
+        </w:trPr>
+        <w:tc>
+          <w:tcPr>
+            <w:tcW w:type="dxa" w:w="9638"/>
+          </w:tcPr>
+          <w:p>
+            <w:r>
+              <w:rPr>
+                <w:b/>
+                <w:color w:val="7030A0"/>
+                <w:sz w:val="16"/>
+              </w:rPr>
+              <w:t>RESPUESTA</w:t>
+            </w:r>
+          </w:p>
+          <w:p/>
+          <w:p/>
+          <w:p/>
+        </w:tc>
+      </w:tr>
+    </w:tbl>
+    <w:p>
+      <w:pPr>
+        <w:spacing w:before="60" w:after="160"/>
+      </w:pPr>
+      <w:r>
+        <w:rPr>
+          <w:color w:val="6B6478"/>
+          <w:sz w:val="17"/>
+        </w:rPr>
+        <w:t>Respondió: ____________________________     Estado:   ☐ Resuelta    ☐ Sigue abierta    ☐ Lo revisa Ellucian</w:t>
+      </w:r>
+    </w:p>
+    <w:p>
+      <w:pPr>
+        <w:pStyle w:val="Heading3"/>
+      </w:pPr>
+      <w:r>
+        <w:rPr>
+          <w:color w:val="7030A0"/>
+        </w:rPr>
+        <w:t xml:space="preserve">U38  </w:t>
+      </w:r>
+      <w:r>
+        <w:t>Retiro prohibido: ¿se bloquea en Banner?</w:t>
+      </w:r>
+    </w:p>
+    <w:p>
+      <w:pPr>
+        <w:keepNext/>
+      </w:pPr>
+      <w:r>
+        <w:rPr>
+          <w:b w:val="0"/>
+          <w:i w:val="0"/>
+        </w:rPr>
+        <w:t>El alumno no puede reservar ni retirarse (queda INH), salvo salud. En Banner el retiro DD funciona (Script 08). ¿Se bloquea el retiro en Banner o se controla fuera, y quién aprueba la excepción por salud?</w:t>
+      </w:r>
+    </w:p>
+    <w:p>
+      <w:pPr>
+        <w:keepNext/>
+        <w:ind w:left="170"/>
+      </w:pPr>
+      <w:r>
+        <w:rPr>
+          <w:b/>
+          <w:color w:val="4EA72E"/>
+          <w:sz w:val="19"/>
+        </w:rPr>
+        <w:t xml:space="preserve">Lo que ya sabemos: </w:t>
+      </w:r>
+      <w:r>
+        <w:rPr>
+          <w:b w:val="0"/>
+          <w:i w:val="0"/>
+          <w:color w:val="4A4458"/>
+          <w:sz w:val="19"/>
+        </w:rPr>
+        <w:t>Acuerdo de Directorio 0453-2013 SG-USS: sin reserva ni retiro (INH), salvo salud. En TEST el retiro DD funciona (Script 08).</w:t>
+      </w:r>
+    </w:p>
+    <w:tbl>
+      <w:tblPr>
+        <w:tblW w:type="auto" w:w="0"/>
+        <w:jc w:val="center"/>
+        <w:tblBorders>
+          <w:top w:val="single" w:sz="6" w:space="0" w:color="B9A3D9"/>
+          <w:left w:val="single" w:sz="6" w:space="0" w:color="B9A3D9"/>
+          <w:bottom w:val="single" w:sz="6" w:space="0" w:color="B9A3D9"/>
+          <w:right w:val="single" w:sz="6" w:space="0" w:color="B9A3D9"/>
+          <w:insideH w:val="single" w:sz="6" w:space="0" w:color="B9A3D9"/>
+          <w:insideV w:val="single" w:sz="6" w:space="0" w:color="B9A3D9"/>
+        </w:tblBorders>
+        <w:tblCellMar>
+          <w:top w:w="60" w:type="dxa"/>
+          <w:left w:w="110" w:type="dxa"/>
+          <w:bottom w:w="60" w:type="dxa"/>
+          <w:right w:w="110" w:type="dxa"/>
+        </w:tblCellMar>
+        <w:tblLook w:firstColumn="1" w:firstRow="1" w:lastColumn="0" w:lastRow="0" w:noHBand="0" w:noVBand="1" w:val="04A0"/>
+      </w:tblPr>
+      <w:tblGrid>
+        <w:gridCol w:w="9638"/>
+      </w:tblGrid>
+      <w:tr>
+        <w:trPr>
+          <w:cantSplit/>
+        </w:trPr>
+        <w:tc>
+          <w:tcPr>
+            <w:tcW w:type="dxa" w:w="9638"/>
+          </w:tcPr>
+          <w:p>
+            <w:r>
+              <w:rPr>
+                <w:b/>
+                <w:color w:val="7030A0"/>
+                <w:sz w:val="16"/>
+              </w:rPr>
+              <w:t>RESPUESTA</w:t>
+            </w:r>
+          </w:p>
+          <w:p/>
+          <w:p/>
+          <w:p/>
+        </w:tc>
+      </w:tr>
+    </w:tbl>
+    <w:p>
+      <w:pPr>
+        <w:spacing w:before="60" w:after="160"/>
+      </w:pPr>
+      <w:r>
+        <w:rPr>
+          <w:color w:val="6B6478"/>
+          <w:sz w:val="17"/>
+        </w:rPr>
+        <w:t>Respondió: ____________________________     Estado:   ☐ Resuelta    ☐ Sigue abierta    ☐ Lo revisa Ellucian</w:t>
+      </w:r>
+    </w:p>
+    <w:p>
+      <w:pPr>
+        <w:pStyle w:val="Heading3"/>
+      </w:pPr>
+      <w:r>
+        <w:rPr>
+          <w:color w:val="7030A0"/>
+        </w:rPr>
+        <w:t xml:space="preserve">U36  </w:t>
+      </w:r>
+      <w:r>
+        <w:t>Tabla de pago con base S/ 330</w:t>
+      </w:r>
+    </w:p>
+    <w:p>
+      <w:pPr>
+        <w:keepNext/>
+      </w:pPr>
+      <w:r>
+        <w:rPr>
+          <w:b/>
+          <w:i w:val="0"/>
+        </w:rPr>
+        <w:t>Tabla de pago con base S/ 330</w:t>
+      </w:r>
+      <w:r>
+        <w:rPr>
+          <w:b w:val="0"/>
+          <w:i w:val="0"/>
+        </w:rPr>
+        <w:t xml:space="preserve"> (PDF 2025, pág. 11: contado S/ 313.50, 3 × S/ 110, 2 × S/ 165, diferido S/ 346.50): ¿a qué aplica (filiales 2025, otra modalidad)?</w:t>
+      </w:r>
+    </w:p>
+    <w:tbl>
+      <w:tblPr>
+        <w:tblW w:type="auto" w:w="0"/>
+        <w:jc w:val="center"/>
+        <w:tblBorders>
+          <w:top w:val="single" w:sz="6" w:space="0" w:color="B9A3D9"/>
+          <w:left w:val="single" w:sz="6" w:space="0" w:color="B9A3D9"/>
+          <w:bottom w:val="single" w:sz="6" w:space="0" w:color="B9A3D9"/>
+          <w:right w:val="single" w:sz="6" w:space="0" w:color="B9A3D9"/>
+          <w:insideH w:val="single" w:sz="6" w:space="0" w:color="B9A3D9"/>
+          <w:insideV w:val="single" w:sz="6" w:space="0" w:color="B9A3D9"/>
+        </w:tblBorders>
+        <w:tblCellMar>
+          <w:top w:w="60" w:type="dxa"/>
+          <w:left w:w="110" w:type="dxa"/>
+          <w:bottom w:w="60" w:type="dxa"/>
+          <w:right w:w="110" w:type="dxa"/>
+        </w:tblCellMar>
+        <w:tblLook w:firstColumn="1" w:firstRow="1" w:lastColumn="0" w:lastRow="0" w:noHBand="0" w:noVBand="1" w:val="04A0"/>
+      </w:tblPr>
+      <w:tblGrid>
+        <w:gridCol w:w="9638"/>
+      </w:tblGrid>
+      <w:tr>
+        <w:trPr>
+          <w:cantSplit/>
+        </w:trPr>
+        <w:tc>
+          <w:tcPr>
+            <w:tcW w:type="dxa" w:w="9638"/>
+          </w:tcPr>
+          <w:p>
+            <w:r>
+              <w:rPr>
+                <w:b/>
+                <w:color w:val="7030A0"/>
+                <w:sz w:val="16"/>
+              </w:rPr>
+              <w:t>RESPUESTA</w:t>
+            </w:r>
+          </w:p>
+          <w:p/>
+          <w:p/>
+          <w:p/>
+        </w:tc>
+      </w:tr>
+    </w:tbl>
+    <w:p>
+      <w:pPr>
+        <w:spacing w:before="60" w:after="160"/>
+      </w:pPr>
+      <w:r>
+        <w:rPr>
+          <w:color w:val="6B6478"/>
+          <w:sz w:val="17"/>
+        </w:rPr>
+        <w:t>Respondió: ____________________________     Estado:   ☐ Resuelta    ☐ Sigue abierta    ☐ Lo revisa Ellucian</w:t>
+      </w:r>
+    </w:p>
+    <w:p>
+      <w:pPr>
+        <w:pStyle w:val="Heading3"/>
+      </w:pPr>
+      <w:r>
+        <w:rPr>
+          <w:color w:val="7030A0"/>
+        </w:rPr>
+        <w:t xml:space="preserve">U39  </w:t>
+      </w:r>
+      <w:r>
+        <w:t>Ciclos de la acreditación en Emprendimiento</w:t>
+      </w:r>
+    </w:p>
+    <w:p>
+      <w:pPr>
+        <w:keepNext/>
+      </w:pPr>
+      <w:r>
+        <w:rPr>
+          <w:b w:val="0"/>
+          <w:i w:val="0"/>
+        </w:rPr>
+        <w:t>La Resolución Rectoral 175-2023 dice 7.º al 8.º ciclo; la lámina 1 de 2026 dice 7.º al 9.º. ¿Cuál rige?</w:t>
       </w:r>
     </w:p>
     <w:tbl>

</xml_diff>